<commit_message>
docs: update Parts I-VI and README for the 13 October changes
</commit_message>
<xml_diff>
--- a/Docs/Thermo-Tactics_Part1_Final_System_Architecture.docx
+++ b/Docs/Thermo-Tactics_Part1_Final_System_Architecture.docx
@@ -80,7 +80,7 @@
           <w:sz w:val="21"/>
           <w:szCs w:val="21"/>
         </w:rPr>
-        <w:t xml:space="preserve"> (34 runtime C# scripts plus three editor scripts, revised 13 October 2026). All of Stage 1 (Baguio) is playable from a Main Menu: 10 levels in order with unlocking, 13 animated unit types plus 6 elite variants, the Clearcut Behemoth boss in Level 10, Oxygen Points, the 1.5 °C loss rule, Settings, and save and Continue. Everything is stored in a local </w:t>
+        <w:t xml:space="preserve"> (39 runtime C# scripts, two editor-only test scripts and four editor scripts, revised 13 October 2026). All of Stage 1 (Baguio) is playable from a Main Menu: 10 levels in order with unlocking and 1–3 stars, 13 animated unit types plus 6 elite variants, the Clearcut Behemoth boss in Level 10, a camera that follows each lane as the turn resolves, Oxygen Points, the 1.5 °C loss rule, Settings, and save and Continue. Everything is stored in a local </w:t>
       </w:r>
       <w:r>
         <w:rPr>
@@ -1366,7 +1366,7 @@
                 <w:sz w:val="18"/>
                 <w:szCs w:val="18"/>
               </w:rPr>
-              <w:t xml:space="preserve"> (schema version 2).</w:t>
+              <w:t xml:space="preserve"> (schema version 3; version 3 added the best stars per level and the peak temperature in the saved game).</w:t>
             </w:r>
           </w:p>
           <w:p>
@@ -2486,7 +2486,28 @@
                 <w:sz w:val="18"/>
                 <w:szCs w:val="18"/>
               </w:rPr>
-              <w:t xml:space="preserve">. Battle scene: </w:t>
+              <w:t xml:space="preserve">. The title has a living background (</w:t>
+            </w:r>
+            <w:r>
+              <w:rPr>
+                <w:rFonts w:ascii="Consolas" w:cs="Consolas" w:eastAsia="Consolas" w:hAnsi="Consolas"/>
+                <w:b w:val="false"/>
+                <w:bCs w:val="false"/>
+                <w:color w:val="0D47A1"/>
+                <w:sz w:val="17"/>
+                <w:szCs w:val="17"/>
+              </w:rPr>
+              <w:t xml:space="preserve">MenuAmbience.cs</w:t>
+            </w:r>
+            <w:r>
+              <w:rPr>
+                <w:rFonts w:ascii="Arial" w:cs="Arial" w:eastAsia="Arial" w:hAnsi="Arial"/>
+                <w:b w:val="false"/>
+                <w:bCs w:val="false"/>
+                <w:sz w:val="18"/>
+                <w:szCs w:val="18"/>
+              </w:rPr>
+              <w:t xml:space="preserve">) and a Baguio progress strip with stars. Battle scene: </w:t>
             </w:r>
             <w:r>
               <w:rPr>
@@ -2507,7 +2528,7 @@
                 <w:sz w:val="18"/>
                 <w:szCs w:val="18"/>
               </w:rPr>
-              <w:t xml:space="preserve"> (HUD, boss panel, Pause, End), </w:t>
+              <w:t xml:space="preserve"> (HUD, lane banner, boss panel, Pause, Level Complete / Level Failed, Stage Complete), </w:t>
             </w:r>
             <w:r>
               <w:rPr>
@@ -2550,6 +2571,48 @@
                 <w:szCs w:val="18"/>
               </w:rPr>
               <w:t xml:space="preserve">. </w:t>
+            </w:r>
+            <w:r>
+              <w:rPr>
+                <w:rFonts w:ascii="Consolas" w:cs="Consolas" w:eastAsia="Consolas" w:hAnsi="Consolas"/>
+                <w:b w:val="false"/>
+                <w:bCs w:val="false"/>
+                <w:color w:val="0D47A1"/>
+                <w:sz w:val="17"/>
+                <w:szCs w:val="17"/>
+              </w:rPr>
+              <w:t xml:space="preserve">ButtonFx.cs</w:t>
+            </w:r>
+            <w:r>
+              <w:rPr>
+                <w:rFonts w:ascii="Arial" w:cs="Arial" w:eastAsia="Arial" w:hAnsi="Arial"/>
+                <w:b w:val="false"/>
+                <w:bCs w:val="false"/>
+                <w:sz w:val="18"/>
+                <w:szCs w:val="18"/>
+              </w:rPr>
+              <w:t xml:space="preserve"> and </w:t>
+            </w:r>
+            <w:r>
+              <w:rPr>
+                <w:rFonts w:ascii="Consolas" w:cs="Consolas" w:eastAsia="Consolas" w:hAnsi="Consolas"/>
+                <w:b w:val="false"/>
+                <w:bCs w:val="false"/>
+                <w:color w:val="0D47A1"/>
+                <w:sz w:val="17"/>
+                <w:szCs w:val="17"/>
+              </w:rPr>
+              <w:t xml:space="preserve">PanelFx.cs</w:t>
+            </w:r>
+            <w:r>
+              <w:rPr>
+                <w:rFonts w:ascii="Arial" w:cs="Arial" w:eastAsia="Arial" w:hAnsi="Arial"/>
+                <w:b w:val="false"/>
+                <w:bCs w:val="false"/>
+                <w:sz w:val="18"/>
+                <w:szCs w:val="18"/>
+              </w:rPr>
+              <w:t xml:space="preserve"> animate buttons and screens; </w:t>
             </w:r>
             <w:r>
               <w:rPr>
@@ -4083,6 +4146,321 @@
                 <w:szCs w:val="18"/>
               </w:rPr>
               <w:t xml:space="preserve"> stores raw scores and shows gain as "N/A" when pre = 0. The study's ≥ 30% target is computed from group average scores in the exported CSV.</w:t>
+            </w:r>
+          </w:p>
+        </w:tc>
+      </w:tr>
+      <w:tr>
+        <w:trPr>
+          <w:cantSplit/>
+        </w:trPr>
+        <w:tc>
+          <w:tcPr>
+            <w:tcW w:type="dxa" w:w="500"/>
+            <w:tcBorders>
+              <w:top w:val="single" w:color="B0BEC5" w:sz="4"/>
+              <w:left w:val="single" w:color="B0BEC5" w:sz="4"/>
+              <w:bottom w:val="single" w:color="B0BEC5" w:sz="4"/>
+              <w:right w:val="single" w:color="B0BEC5" w:sz="4"/>
+            </w:tcBorders>
+            <w:tcMar>
+              <w:top w:type="dxa" w:w="60"/>
+              <w:left w:type="dxa" w:w="100"/>
+              <w:bottom w:type="dxa" w:w="60"/>
+              <w:right w:type="dxa" w:w="100"/>
+            </w:tcMar>
+            <w:vAlign w:val="top"/>
+          </w:tcPr>
+          <w:p>
+            <w:pPr>
+              <w:spacing w:after="30" w:line="252"/>
+            </w:pPr>
+            <w:r>
+              <w:rPr>
+                <w:rFonts w:ascii="Arial" w:cs="Arial" w:eastAsia="Arial" w:hAnsi="Arial"/>
+                <w:b w:val="false"/>
+                <w:bCs w:val="false"/>
+                <w:sz w:val="18"/>
+                <w:szCs w:val="18"/>
+              </w:rPr>
+              <w:t xml:space="preserve">19</w:t>
+            </w:r>
+          </w:p>
+        </w:tc>
+        <w:tc>
+          <w:tcPr>
+            <w:tcW w:type="dxa" w:w="3700"/>
+            <w:tcBorders>
+              <w:top w:val="single" w:color="B0BEC5" w:sz="4"/>
+              <w:left w:val="single" w:color="B0BEC5" w:sz="4"/>
+              <w:bottom w:val="single" w:color="B0BEC5" w:sz="4"/>
+              <w:right w:val="single" w:color="B0BEC5" w:sz="4"/>
+            </w:tcBorders>
+            <w:tcMar>
+              <w:top w:type="dxa" w:w="60"/>
+              <w:left w:type="dxa" w:w="100"/>
+              <w:bottom w:type="dxa" w:w="60"/>
+              <w:right w:type="dxa" w:w="100"/>
+            </w:tcMar>
+            <w:vAlign w:val="top"/>
+          </w:tcPr>
+          <w:p>
+            <w:pPr>
+              <w:spacing w:after="30" w:line="252"/>
+            </w:pPr>
+            <w:r>
+              <w:rPr>
+                <w:rFonts w:ascii="Arial" w:cs="Arial" w:eastAsia="Arial" w:hAnsi="Arial"/>
+                <w:b w:val="false"/>
+                <w:bCs w:val="false"/>
+                <w:sz w:val="18"/>
+                <w:szCs w:val="18"/>
+              </w:rPr>
+              <w:t xml:space="preserve">All lanes attacked at the same moment, so the player could not see what happened in each lane.</w:t>
+            </w:r>
+          </w:p>
+        </w:tc>
+        <w:tc>
+          <w:tcPr>
+            <w:tcW w:type="dxa" w:w="5880"/>
+            <w:tcBorders>
+              <w:top w:val="single" w:color="B0BEC5" w:sz="4"/>
+              <w:left w:val="single" w:color="B0BEC5" w:sz="4"/>
+              <w:bottom w:val="single" w:color="B0BEC5" w:sz="4"/>
+              <w:right w:val="single" w:color="B0BEC5" w:sz="4"/>
+            </w:tcBorders>
+            <w:tcMar>
+              <w:top w:type="dxa" w:w="60"/>
+              <w:left w:type="dxa" w:w="100"/>
+              <w:bottom w:type="dxa" w:w="60"/>
+              <w:right w:type="dxa" w:w="100"/>
+            </w:tcMar>
+            <w:vAlign w:val="top"/>
+          </w:tcPr>
+          <w:p>
+            <w:pPr>
+              <w:spacing w:after="30" w:line="252"/>
+            </w:pPr>
+            <w:r>
+              <w:rPr>
+                <w:rFonts w:ascii="Arial" w:cs="Arial" w:eastAsia="Arial" w:hAnsi="Arial"/>
+                <w:b/>
+                <w:bCs/>
+                <w:sz w:val="18"/>
+                <w:szCs w:val="18"/>
+              </w:rPr>
+              <w:t xml:space="preserve">Built.</w:t>
+            </w:r>
+            <w:r>
+              <w:rPr>
+                <w:rFonts w:ascii="Arial" w:cs="Arial" w:eastAsia="Arial" w:hAnsi="Arial"/>
+                <w:b w:val="false"/>
+                <w:bCs w:val="false"/>
+                <w:sz w:val="18"/>
+                <w:szCs w:val="18"/>
+              </w:rPr>
+              <w:t xml:space="preserve"> </w:t>
+            </w:r>
+            <w:r>
+              <w:rPr>
+                <w:rFonts w:ascii="Consolas" w:cs="Consolas" w:eastAsia="Consolas" w:hAnsi="Consolas"/>
+                <w:b w:val="false"/>
+                <w:bCs w:val="false"/>
+                <w:color w:val="0D47A1"/>
+                <w:sz w:val="17"/>
+                <w:szCs w:val="17"/>
+              </w:rPr>
+              <w:t xml:space="preserve">TurnManager.cs</w:t>
+            </w:r>
+            <w:r>
+              <w:rPr>
+                <w:rFonts w:ascii="Arial" w:cs="Arial" w:eastAsia="Arial" w:hAnsi="Arial"/>
+                <w:b w:val="false"/>
+                <w:bCs w:val="false"/>
+                <w:sz w:val="18"/>
+                <w:szCs w:val="18"/>
+              </w:rPr>
+              <w:t xml:space="preserve"> resolves the turn lane by lane (1 to 6). </w:t>
+            </w:r>
+            <w:r>
+              <w:rPr>
+                <w:rFonts w:ascii="Consolas" w:cs="Consolas" w:eastAsia="Consolas" w:hAnsi="Consolas"/>
+                <w:b w:val="false"/>
+                <w:bCs w:val="false"/>
+                <w:color w:val="0D47A1"/>
+                <w:sz w:val="17"/>
+                <w:szCs w:val="17"/>
+              </w:rPr>
+              <w:t xml:space="preserve">BattleCamera.cs</w:t>
+            </w:r>
+            <w:r>
+              <w:rPr>
+                <w:rFonts w:ascii="Arial" w:cs="Arial" w:eastAsia="Arial" w:hAnsi="Arial"/>
+                <w:b w:val="false"/>
+                <w:bCs w:val="false"/>
+                <w:sz w:val="18"/>
+                <w:szCs w:val="18"/>
+              </w:rPr>
+              <w:t xml:space="preserve"> zooms in on each lane: the ally attacks (an enemy, or the empty slot to cool the planet), then the enemy, if still standing, attacks (the ally, or the undefended lane to heat it). A lane with no units is shown briefly and skipped. A banner names the lane and its result. Settings can turn the zoom off. A balance simulation showed win rates change by less than 1%.</w:t>
+            </w:r>
+          </w:p>
+        </w:tc>
+      </w:tr>
+      <w:tr>
+        <w:trPr>
+          <w:cantSplit/>
+        </w:trPr>
+        <w:tc>
+          <w:tcPr>
+            <w:tcW w:type="dxa" w:w="500"/>
+            <w:tcBorders>
+              <w:top w:val="single" w:color="B0BEC5" w:sz="4"/>
+              <w:left w:val="single" w:color="B0BEC5" w:sz="4"/>
+              <w:bottom w:val="single" w:color="B0BEC5" w:sz="4"/>
+              <w:right w:val="single" w:color="B0BEC5" w:sz="4"/>
+            </w:tcBorders>
+            <w:shd w:fill="F5F8FC" w:color="auto" w:val="clear"/>
+            <w:tcMar>
+              <w:top w:type="dxa" w:w="60"/>
+              <w:left w:type="dxa" w:w="100"/>
+              <w:bottom w:type="dxa" w:w="60"/>
+              <w:right w:type="dxa" w:w="100"/>
+            </w:tcMar>
+            <w:vAlign w:val="top"/>
+          </w:tcPr>
+          <w:p>
+            <w:pPr>
+              <w:spacing w:after="30" w:line="252"/>
+            </w:pPr>
+            <w:r>
+              <w:rPr>
+                <w:rFonts w:ascii="Arial" w:cs="Arial" w:eastAsia="Arial" w:hAnsi="Arial"/>
+                <w:b w:val="false"/>
+                <w:bCs w:val="false"/>
+                <w:sz w:val="18"/>
+                <w:szCs w:val="18"/>
+              </w:rPr>
+              <w:t xml:space="preserve">20</w:t>
+            </w:r>
+          </w:p>
+        </w:tc>
+        <w:tc>
+          <w:tcPr>
+            <w:tcW w:type="dxa" w:w="3700"/>
+            <w:tcBorders>
+              <w:top w:val="single" w:color="B0BEC5" w:sz="4"/>
+              <w:left w:val="single" w:color="B0BEC5" w:sz="4"/>
+              <w:bottom w:val="single" w:color="B0BEC5" w:sz="4"/>
+              <w:right w:val="single" w:color="B0BEC5" w:sz="4"/>
+            </w:tcBorders>
+            <w:shd w:fill="F5F8FC" w:color="auto" w:val="clear"/>
+            <w:tcMar>
+              <w:top w:type="dxa" w:w="60"/>
+              <w:left w:type="dxa" w:w="100"/>
+              <w:bottom w:type="dxa" w:w="60"/>
+              <w:right w:type="dxa" w:w="100"/>
+            </w:tcMar>
+            <w:vAlign w:val="top"/>
+          </w:tcPr>
+          <w:p>
+            <w:pPr>
+              <w:spacing w:after="30" w:line="252"/>
+            </w:pPr>
+            <w:r>
+              <w:rPr>
+                <w:rFonts w:ascii="Arial" w:cs="Arial" w:eastAsia="Arial" w:hAnsi="Arial"/>
+                <w:b w:val="false"/>
+                <w:bCs w:val="false"/>
+                <w:sz w:val="18"/>
+                <w:szCs w:val="18"/>
+              </w:rPr>
+              <w:t xml:space="preserve">A level gave no reward beyond unlocking the next one.</w:t>
+            </w:r>
+          </w:p>
+        </w:tc>
+        <w:tc>
+          <w:tcPr>
+            <w:tcW w:type="dxa" w:w="5880"/>
+            <w:tcBorders>
+              <w:top w:val="single" w:color="B0BEC5" w:sz="4"/>
+              <w:left w:val="single" w:color="B0BEC5" w:sz="4"/>
+              <w:bottom w:val="single" w:color="B0BEC5" w:sz="4"/>
+              <w:right w:val="single" w:color="B0BEC5" w:sz="4"/>
+            </w:tcBorders>
+            <w:shd w:fill="F5F8FC" w:color="auto" w:val="clear"/>
+            <w:tcMar>
+              <w:top w:type="dxa" w:w="60"/>
+              <w:left w:type="dxa" w:w="100"/>
+              <w:bottom w:type="dxa" w:w="60"/>
+              <w:right w:type="dxa" w:w="100"/>
+            </w:tcMar>
+            <w:vAlign w:val="top"/>
+          </w:tcPr>
+          <w:p>
+            <w:pPr>
+              <w:spacing w:after="30" w:line="252"/>
+            </w:pPr>
+            <w:r>
+              <w:rPr>
+                <w:rFonts w:ascii="Arial" w:cs="Arial" w:eastAsia="Arial" w:hAnsi="Arial"/>
+                <w:b/>
+                <w:bCs/>
+                <w:sz w:val="18"/>
+                <w:szCs w:val="18"/>
+              </w:rPr>
+              <w:t xml:space="preserve">Built.</w:t>
+            </w:r>
+            <w:r>
+              <w:rPr>
+                <w:rFonts w:ascii="Arial" w:cs="Arial" w:eastAsia="Arial" w:hAnsi="Arial"/>
+                <w:b w:val="false"/>
+                <w:bCs w:val="false"/>
+                <w:sz w:val="18"/>
+                <w:szCs w:val="18"/>
+              </w:rPr>
+              <w:t xml:space="preserve"> 1–3 stars per win, rated by the highest temperature reached during the level (3 stars at or below 1.20 °C, 2 at or below 1.35 °C; </w:t>
+            </w:r>
+            <w:r>
+              <w:rPr>
+                <w:rFonts w:ascii="Consolas" w:cs="Consolas" w:eastAsia="Consolas" w:hAnsi="Consolas"/>
+                <w:b w:val="false"/>
+                <w:bCs w:val="false"/>
+                <w:color w:val="0D47A1"/>
+                <w:sz w:val="17"/>
+                <w:szCs w:val="17"/>
+              </w:rPr>
+              <w:t xml:space="preserve">StarRating.cs</w:t>
+            </w:r>
+            <w:r>
+              <w:rPr>
+                <w:rFonts w:ascii="Arial" w:cs="Arial" w:eastAsia="Arial" w:hAnsi="Arial"/>
+                <w:b w:val="false"/>
+                <w:bCs w:val="false"/>
+                <w:sz w:val="18"/>
+                <w:szCs w:val="18"/>
+              </w:rPr>
+              <w:t xml:space="preserve">). The final temperature is not used because allies cool the planet back down by the end. The best stars are kept in </w:t>
+            </w:r>
+            <w:r>
+              <w:rPr>
+                <w:rFonts w:ascii="Consolas" w:cs="Consolas" w:eastAsia="Consolas" w:hAnsi="Consolas"/>
+                <w:b w:val="false"/>
+                <w:bCs w:val="false"/>
+                <w:color w:val="0D47A1"/>
+                <w:sz w:val="17"/>
+                <w:szCs w:val="17"/>
+              </w:rPr>
+              <w:t xml:space="preserve">level_progress.best_stars</w:t>
+            </w:r>
+            <w:r>
+              <w:rPr>
+                <w:rFonts w:ascii="Arial" w:cs="Arial" w:eastAsia="Arial" w:hAnsi="Arial"/>
+                <w:b w:val="false"/>
+                <w:bCs w:val="false"/>
+                <w:sz w:val="18"/>
+                <w:szCs w:val="18"/>
+              </w:rPr>
+              <w:t xml:space="preserve">. The end screens offer Retry, Next Level, Level Select and Stage Select; winning Level 10 shows a Stage Complete screen with the stage's star total.</w:t>
             </w:r>
           </w:p>
         </w:tc>
@@ -5244,7 +5622,7 @@
                 <w:sz w:val="18"/>
                 <w:szCs w:val="18"/>
               </w:rPr>
-              <w:t xml:space="preserve">HUD, idle / attack / hurt animations, fog, Victory / Defeat screen, Results list</w:t>
+              <w:t xml:space="preserve">HUD, lane camera and lane banner, idle / attack / hurt animations, fog, Level Complete / Failed and Stage Complete screens with stars, Results list</w:t>
             </w:r>
           </w:p>
         </w:tc>
@@ -7295,7 +7673,7 @@
           <w:sz w:val="21"/>
           <w:szCs w:val="21"/>
         </w:rPr>
-        <w:t xml:space="preserve"> runs the ally phase: every ally attacks the enemy in its lane, or cools an empty lane through </w:t>
+        <w:t xml:space="preserve"> goes through lanes 1 to 6; </w:t>
       </w:r>
       <w:r>
         <w:rPr>
@@ -7304,15 +7682,15 @@
           <w:sz w:val="20"/>
           <w:szCs w:val="20"/>
         </w:rPr>
-        <w:t xml:space="preserve">LaneController.cs</w:t>
-      </w:r>
-      <w:r>
-        <w:rPr>
-          <w:rFonts w:ascii="Arial" w:cs="Arial" w:eastAsia="Arial" w:hAnsi="Arial"/>
-          <w:sz w:val="21"/>
-          <w:szCs w:val="21"/>
-        </w:rPr>
-        <w:t xml:space="preserve">.</w:t>
+        <w:t xml:space="preserve">BattleCamera.cs</w:t>
+      </w:r>
+      <w:r>
+        <w:rPr>
+          <w:rFonts w:ascii="Arial" w:cs="Arial" w:eastAsia="Arial" w:hAnsi="Arial"/>
+          <w:sz w:val="21"/>
+          <w:szCs w:val="21"/>
+        </w:rPr>
+        <w:t xml:space="preserve"> zooms in on each one.</w:t>
       </w:r>
       <w:r>
         <w:br/>
@@ -7323,29 +7701,7 @@
           <w:sz w:val="21"/>
           <w:szCs w:val="21"/>
         </w:rPr>
-        <w:t xml:space="preserve">2. If the wave is cleared, the enemy phase is skipped: after a short pause the next wave spawns at turn 1, or the level is won.</w:t>
-      </w:r>
-      <w:r>
-        <w:br/>
-      </w:r>
-      <w:r>
-        <w:rPr>
-          <w:rFonts w:ascii="Arial" w:cs="Arial" w:eastAsia="Arial" w:hAnsi="Arial"/>
-          <w:sz w:val="21"/>
-          <w:szCs w:val="21"/>
-        </w:rPr>
-        <w:t xml:space="preserve">3. Otherwise the enemy phase runs: an undefended lane heats by 0.10 °C.</w:t>
-      </w:r>
-      <w:r>
-        <w:br/>
-      </w:r>
-      <w:r>
-        <w:rPr>
-          <w:rFonts w:ascii="Arial" w:cs="Arial" w:eastAsia="Arial" w:hAnsi="Arial"/>
-          <w:sz w:val="21"/>
-          <w:szCs w:val="21"/>
-        </w:rPr>
-        <w:t xml:space="preserve">4. </w:t>
+        <w:t xml:space="preserve">2. In each lane the ally attacks the enemy, or cools the empty slot through </w:t>
       </w:r>
       <w:r>
         <w:rPr>
@@ -7354,15 +7710,15 @@
           <w:sz w:val="20"/>
           <w:szCs w:val="20"/>
         </w:rPr>
-        <w:t xml:space="preserve">TemperatureSystem.HasReachedThreshold</w:t>
-      </w:r>
-      <w:r>
-        <w:rPr>
-          <w:rFonts w:ascii="Arial" w:cs="Arial" w:eastAsia="Arial" w:hAnsi="Arial"/>
-          <w:sz w:val="21"/>
-          <w:szCs w:val="21"/>
-        </w:rPr>
-        <w:t xml:space="preserve"> is checked; reaching 1.5 °C means a loss.</w:t>
+        <w:t xml:space="preserve">LaneController.cs</w:t>
+      </w:r>
+      <w:r>
+        <w:rPr>
+          <w:rFonts w:ascii="Arial" w:cs="Arial" w:eastAsia="Arial" w:hAnsi="Arial"/>
+          <w:sz w:val="21"/>
+          <w:szCs w:val="21"/>
+        </w:rPr>
+        <w:t xml:space="preserve"> (once per turn); then the enemy, if still standing, attacks the ally or heats the undefended lane by 0.10 °C. Reaching 1.5 °C ends the level at once.</w:t>
       </w:r>
       <w:r>
         <w:br/>
@@ -7373,7 +7729,29 @@
           <w:sz w:val="21"/>
           <w:szCs w:val="21"/>
         </w:rPr>
-        <w:t xml:space="preserve">5. If not, the next turn starts with the OP penalty.</w:t>
+        <w:t xml:space="preserve">3. In the boss wave, allies hit the boss lane by lane, then the boss makes its one move (cleave or slam).</w:t>
+      </w:r>
+      <w:r>
+        <w:br/>
+      </w:r>
+      <w:r>
+        <w:rPr>
+          <w:rFonts w:ascii="Arial" w:cs="Arial" w:eastAsia="Arial" w:hAnsi="Arial"/>
+          <w:sz w:val="21"/>
+          <w:szCs w:val="21"/>
+        </w:rPr>
+        <w:t xml:space="preserve">4. The camera returns to the full board. If the wave is cleared, the next wave spawns at turn 1 or the level is won.</w:t>
+      </w:r>
+      <w:r>
+        <w:br/>
+      </w:r>
+      <w:r>
+        <w:rPr>
+          <w:rFonts w:ascii="Arial" w:cs="Arial" w:eastAsia="Arial" w:hAnsi="Arial"/>
+          <w:sz w:val="21"/>
+          <w:szCs w:val="21"/>
+        </w:rPr>
+        <w:t xml:space="preserve">5. Otherwise the next turn starts with the OP penalty.</w:t>
       </w:r>
     </w:p>
     <w:p>
@@ -8109,7 +8487,7 @@
           <w:sz w:val="21"/>
           <w:szCs w:val="21"/>
         </w:rPr>
-        <w:t xml:space="preserve"> owns the HUD (level and wave, temperature bar, Oxygen, Pause), the deploy bar and End Turn, the boss panel, Pause, the End screen (Victory or Defeat) and the Results panel.</w:t>
+        <w:t xml:space="preserve"> owns the HUD (level and wave, temperature bar, Oxygen, Pause), the deploy bar and End Turn, the lane banner during End Turn, the boss panel, Pause, the Level Complete / Level Failed screen (stars, Retry, Next Level, Level Select, Stage Select), the Stage Complete screen and the Results panel.</w:t>
       </w:r>
     </w:p>
     <w:p>
@@ -8519,7 +8897,7 @@
           <w:sz w:val="21"/>
           <w:szCs w:val="21"/>
         </w:rPr>
-        <w:t xml:space="preserve"> and the unit scripts resolve placement, simultaneous lane attacks, damage, the hurt animation and death fade-out, and the climate result of each attack on the 12 slots.</w:t>
+        <w:t xml:space="preserve"> and the unit scripts resolve placement, lane-by-lane attacks, damage, the hurt animation and death fade-out, and the climate result of each attack on the 12 slots.</w:t>
       </w:r>
     </w:p>
     <w:p>
@@ -8976,7 +9354,7 @@
           <w:sz w:val="21"/>
           <w:szCs w:val="21"/>
         </w:rPr>
-        <w:t xml:space="preserve"> (unlocks) and </w:t>
+        <w:t xml:space="preserve"> (unlocks and best stars) and </w:t>
       </w:r>
       <w:r>
         <w:rPr>
@@ -8993,7 +9371,7 @@
           <w:sz w:val="21"/>
           <w:szCs w:val="21"/>
         </w:rPr>
-        <w:t xml:space="preserve"> (Continue); schema version 2.</w:t>
+        <w:t xml:space="preserve"> (Continue); schema version 3.</w:t>
       </w:r>
       <w:r>
         <w:br/>
@@ -10225,7 +10603,7 @@
                 <w:sz w:val="18"/>
                 <w:szCs w:val="18"/>
               </w:rPr>
-              <w:t xml:space="preserve">Battle HUD, boss panel, Pause and End screens; sends commands, displays state</w:t>
+              <w:t xml:space="preserve">Battle HUD, lane banner, boss panel, Pause, Level Complete / Failed and Stage Complete screens; sends commands, displays state</w:t>
             </w:r>
           </w:p>
         </w:tc>
@@ -10513,7 +10891,49 @@
                 <w:sz w:val="17"/>
                 <w:szCs w:val="17"/>
               </w:rPr>
-              <w:t xml:space="preserve">FogScroller.cs</w:t>
+              <w:t xml:space="preserve">MenuAmbience.cs</w:t>
+            </w:r>
+            <w:r>
+              <w:rPr>
+                <w:rFonts w:ascii="Arial" w:cs="Arial" w:eastAsia="Arial" w:hAnsi="Arial"/>
+                <w:b w:val="false"/>
+                <w:bCs w:val="false"/>
+                <w:sz w:val="18"/>
+                <w:szCs w:val="18"/>
+              </w:rPr>
+              <w:t xml:space="preserve">, </w:t>
+            </w:r>
+            <w:r>
+              <w:rPr>
+                <w:rFonts w:ascii="Consolas" w:cs="Consolas" w:eastAsia="Consolas" w:hAnsi="Consolas"/>
+                <w:b w:val="false"/>
+                <w:bCs w:val="false"/>
+                <w:color w:val="0D47A1"/>
+                <w:sz w:val="17"/>
+                <w:szCs w:val="17"/>
+              </w:rPr>
+              <w:t xml:space="preserve">ButtonFx.cs</w:t>
+            </w:r>
+            <w:r>
+              <w:rPr>
+                <w:rFonts w:ascii="Arial" w:cs="Arial" w:eastAsia="Arial" w:hAnsi="Arial"/>
+                <w:b w:val="false"/>
+                <w:bCs w:val="false"/>
+                <w:sz w:val="18"/>
+                <w:szCs w:val="18"/>
+              </w:rPr>
+              <w:t xml:space="preserve">, </w:t>
+            </w:r>
+            <w:r>
+              <w:rPr>
+                <w:rFonts w:ascii="Consolas" w:cs="Consolas" w:eastAsia="Consolas" w:hAnsi="Consolas"/>
+                <w:b w:val="false"/>
+                <w:bCs w:val="false"/>
+                <w:color w:val="0D47A1"/>
+                <w:sz w:val="17"/>
+                <w:szCs w:val="17"/>
+              </w:rPr>
+              <w:t xml:space="preserve">PanelFx.cs</w:t>
             </w:r>
           </w:p>
         </w:tc>
@@ -10547,7 +10967,7 @@
                 <w:sz w:val="18"/>
                 <w:szCs w:val="18"/>
               </w:rPr>
-              <w:t xml:space="preserve">Drifting Baguio fog whose density follows temperature</w:t>
+              <w:t xml:space="preserve">Living title background (pan, fog, pollen); button hover / press; screens fade in</w:t>
             </w:r>
           </w:p>
         </w:tc>
@@ -10653,28 +11073,7 @@
                 <w:sz w:val="17"/>
                 <w:szCs w:val="17"/>
               </w:rPr>
-              <w:t xml:space="preserve">ClimateBackground.cs</w:t>
-            </w:r>
-            <w:r>
-              <w:rPr>
-                <w:rFonts w:ascii="Arial" w:cs="Arial" w:eastAsia="Arial" w:hAnsi="Arial"/>
-                <w:b w:val="false"/>
-                <w:bCs w:val="false"/>
-                <w:sz w:val="18"/>
-                <w:szCs w:val="18"/>
-              </w:rPr>
-              <w:t xml:space="preserve">, </w:t>
-            </w:r>
-            <w:r>
-              <w:rPr>
-                <w:rFonts w:ascii="Consolas" w:cs="Consolas" w:eastAsia="Consolas" w:hAnsi="Consolas"/>
-                <w:b w:val="false"/>
-                <w:bCs w:val="false"/>
-                <w:color w:val="0D47A1"/>
-                <w:sz w:val="17"/>
-                <w:szCs w:val="17"/>
-              </w:rPr>
-              <w:t xml:space="preserve">AudioManager.cs</w:t>
+              <w:t xml:space="preserve">BattleCamera.cs</w:t>
             </w:r>
           </w:p>
         </w:tc>
@@ -10707,7 +11106,7 @@
                 <w:sz w:val="18"/>
                 <w:szCs w:val="18"/>
               </w:rPr>
-              <w:t xml:space="preserve">Cool / warming / critical backgrounds; music and SFX</w:t>
+              <w:t xml:space="preserve">Zooms in on each lane while End Turn resolves; widens for the boss cleave</w:t>
             </w:r>
           </w:p>
         </w:tc>
@@ -10740,7 +11139,7 @@
                 <w:sz w:val="18"/>
                 <w:szCs w:val="18"/>
               </w:rPr>
-              <w:t xml:space="preserve">Planned</w:t>
+              <w:t xml:space="preserve">Built</w:t>
             </w:r>
           </w:p>
         </w:tc>
@@ -10779,7 +11178,7 @@
                 <w:sz w:val="18"/>
                 <w:szCs w:val="18"/>
               </w:rPr>
-              <w:t xml:space="preserve">Core Logic</w:t>
+              <w:t xml:space="preserve">User Interface</w:t>
             </w:r>
           </w:p>
         </w:tc>
@@ -10814,28 +11213,7 @@
                 <w:sz w:val="17"/>
                 <w:szCs w:val="17"/>
               </w:rPr>
-              <w:t xml:space="preserve">GameManager.cs</w:t>
-            </w:r>
-            <w:r>
-              <w:rPr>
-                <w:rFonts w:ascii="Arial" w:cs="Arial" w:eastAsia="Arial" w:hAnsi="Arial"/>
-                <w:b w:val="false"/>
-                <w:bCs w:val="false"/>
-                <w:sz w:val="18"/>
-                <w:szCs w:val="18"/>
-              </w:rPr>
-              <w:t xml:space="preserve">, </w:t>
-            </w:r>
-            <w:r>
-              <w:rPr>
-                <w:rFonts w:ascii="Consolas" w:cs="Consolas" w:eastAsia="Consolas" w:hAnsi="Consolas"/>
-                <w:b w:val="false"/>
-                <w:bCs w:val="false"/>
-                <w:color w:val="0D47A1"/>
-                <w:sz w:val="17"/>
-                <w:szCs w:val="17"/>
-              </w:rPr>
-              <w:t xml:space="preserve">GameSession.cs</w:t>
+              <w:t xml:space="preserve">FogScroller.cs</w:t>
             </w:r>
           </w:p>
         </w:tc>
@@ -10869,7 +11247,7 @@
                 <w:sz w:val="18"/>
                 <w:szCs w:val="18"/>
               </w:rPr>
-              <w:t xml:space="preserve">Level flow: start or resume → play → win / loss → save result and progress; autosave for Continue</w:t>
+              <w:t xml:space="preserve">Drifting Baguio fog whose density follows temperature</w:t>
             </w:r>
           </w:p>
         </w:tc>
@@ -10941,7 +11319,7 @@
                 <w:sz w:val="18"/>
                 <w:szCs w:val="18"/>
               </w:rPr>
-              <w:t xml:space="preserve">Core Logic</w:t>
+              <w:t xml:space="preserve">User Interface</w:t>
             </w:r>
           </w:p>
         </w:tc>
@@ -10975,7 +11353,28 @@
                 <w:sz w:val="17"/>
                 <w:szCs w:val="17"/>
               </w:rPr>
-              <w:t xml:space="preserve">TurnManager.cs</w:t>
+              <w:t xml:space="preserve">ClimateBackground.cs</w:t>
+            </w:r>
+            <w:r>
+              <w:rPr>
+                <w:rFonts w:ascii="Arial" w:cs="Arial" w:eastAsia="Arial" w:hAnsi="Arial"/>
+                <w:b w:val="false"/>
+                <w:bCs w:val="false"/>
+                <w:sz w:val="18"/>
+                <w:szCs w:val="18"/>
+              </w:rPr>
+              <w:t xml:space="preserve">, </w:t>
+            </w:r>
+            <w:r>
+              <w:rPr>
+                <w:rFonts w:ascii="Consolas" w:cs="Consolas" w:eastAsia="Consolas" w:hAnsi="Consolas"/>
+                <w:b w:val="false"/>
+                <w:bCs w:val="false"/>
+                <w:color w:val="0D47A1"/>
+                <w:sz w:val="17"/>
+                <w:szCs w:val="17"/>
+              </w:rPr>
+              <w:t xml:space="preserve">AudioManager.cs</w:t>
             </w:r>
           </w:p>
         </w:tc>
@@ -11008,7 +11407,7 @@
                 <w:sz w:val="18"/>
                 <w:szCs w:val="18"/>
               </w:rPr>
-              <w:t xml:space="preserve">Ally phase → wave check → enemy phase → temperature check → next turn</w:t>
+              <w:t xml:space="preserve">Cool / warming / critical backgrounds; music and SFX</w:t>
             </w:r>
           </w:p>
         </w:tc>
@@ -11041,7 +11440,7 @@
                 <w:sz w:val="18"/>
                 <w:szCs w:val="18"/>
               </w:rPr>
-              <w:t xml:space="preserve">Built</w:t>
+              <w:t xml:space="preserve">Planned</w:t>
             </w:r>
           </w:p>
         </w:tc>
@@ -11115,7 +11514,28 @@
                 <w:sz w:val="17"/>
                 <w:szCs w:val="17"/>
               </w:rPr>
-              <w:t xml:space="preserve">WaveManager.cs</w:t>
+              <w:t xml:space="preserve">GameManager.cs</w:t>
+            </w:r>
+            <w:r>
+              <w:rPr>
+                <w:rFonts w:ascii="Arial" w:cs="Arial" w:eastAsia="Arial" w:hAnsi="Arial"/>
+                <w:b w:val="false"/>
+                <w:bCs w:val="false"/>
+                <w:sz w:val="18"/>
+                <w:szCs w:val="18"/>
+              </w:rPr>
+              <w:t xml:space="preserve">, </w:t>
+            </w:r>
+            <w:r>
+              <w:rPr>
+                <w:rFonts w:ascii="Consolas" w:cs="Consolas" w:eastAsia="Consolas" w:hAnsi="Consolas"/>
+                <w:b w:val="false"/>
+                <w:bCs w:val="false"/>
+                <w:color w:val="0D47A1"/>
+                <w:sz w:val="17"/>
+                <w:szCs w:val="17"/>
+              </w:rPr>
+              <w:t xml:space="preserve">GameSession.cs</w:t>
             </w:r>
           </w:p>
         </w:tc>
@@ -11149,7 +11569,7 @@
                 <w:sz w:val="18"/>
                 <w:szCs w:val="18"/>
               </w:rPr>
-              <w:t xml:space="preserve">Runs the level's 3–5 waves; spawns enemies or the boss; counts turns in a wave; restores a saved wave</w:t>
+              <w:t xml:space="preserve">Level flow: start or resume → play → win / loss → save result and progress; autosave for Continue</w:t>
             </w:r>
           </w:p>
         </w:tc>
@@ -11255,7 +11675,7 @@
                 <w:sz w:val="17"/>
                 <w:szCs w:val="17"/>
               </w:rPr>
-              <w:t xml:space="preserve">OxygenPointSystem.cs</w:t>
+              <w:t xml:space="preserve">TurnManager.cs</w:t>
             </w:r>
           </w:p>
         </w:tc>
@@ -11288,7 +11708,7 @@
                 <w:sz w:val="18"/>
                 <w:szCs w:val="18"/>
               </w:rPr>
-              <w:t xml:space="preserve">Per-turn OP allowance of the wave minus the long-wave penalty, never below 2</w:t>
+              <w:t xml:space="preserve">Lane by lane: ally attack → enemy attack (boss: one move after all lanes) → wave and temperature checks → next turn</w:t>
             </w:r>
           </w:p>
         </w:tc>
@@ -11395,7 +11815,7 @@
                 <w:sz w:val="17"/>
                 <w:szCs w:val="17"/>
               </w:rPr>
-              <w:t xml:space="preserve">TemperatureSystem.cs</w:t>
+              <w:t xml:space="preserve">StarRating.cs</w:t>
             </w:r>
           </w:p>
         </w:tc>
@@ -11429,7 +11849,7 @@
                 <w:sz w:val="18"/>
                 <w:szCs w:val="18"/>
               </w:rPr>
-              <w:t xml:space="preserve">Global temperature from 1.0 °C; loss when it reaches 1.5 °C</w:t>
+              <w:t xml:space="preserve">1–3 stars from the highest temperature reached (≤ 1.20 °C: 3, ≤ 1.35 °C: 2)</w:t>
             </w:r>
           </w:p>
         </w:tc>
@@ -11535,49 +11955,7 @@
                 <w:sz w:val="17"/>
                 <w:szCs w:val="17"/>
               </w:rPr>
-              <w:t xml:space="preserve">GridManager.cs</w:t>
-            </w:r>
-            <w:r>
-              <w:rPr>
-                <w:rFonts w:ascii="Arial" w:cs="Arial" w:eastAsia="Arial" w:hAnsi="Arial"/>
-                <w:b w:val="false"/>
-                <w:bCs w:val="false"/>
-                <w:sz w:val="18"/>
-                <w:szCs w:val="18"/>
-              </w:rPr>
-              <w:t xml:space="preserve">, </w:t>
-            </w:r>
-            <w:r>
-              <w:rPr>
-                <w:rFonts w:ascii="Consolas" w:cs="Consolas" w:eastAsia="Consolas" w:hAnsi="Consolas"/>
-                <w:b w:val="false"/>
-                <w:bCs w:val="false"/>
-                <w:color w:val="0D47A1"/>
-                <w:sz w:val="17"/>
-                <w:szCs w:val="17"/>
-              </w:rPr>
-              <w:t xml:space="preserve">BoardSlot.cs</w:t>
-            </w:r>
-            <w:r>
-              <w:rPr>
-                <w:rFonts w:ascii="Arial" w:cs="Arial" w:eastAsia="Arial" w:hAnsi="Arial"/>
-                <w:b w:val="false"/>
-                <w:bCs w:val="false"/>
-                <w:sz w:val="18"/>
-                <w:szCs w:val="18"/>
-              </w:rPr>
-              <w:t xml:space="preserve">, </w:t>
-            </w:r>
-            <w:r>
-              <w:rPr>
-                <w:rFonts w:ascii="Consolas" w:cs="Consolas" w:eastAsia="Consolas" w:hAnsi="Consolas"/>
-                <w:b w:val="false"/>
-                <w:bCs w:val="false"/>
-                <w:color w:val="0D47A1"/>
-                <w:sz w:val="17"/>
-                <w:szCs w:val="17"/>
-              </w:rPr>
-              <w:t xml:space="preserve">IsoBoardLayout.cs</w:t>
+              <w:t xml:space="preserve">WaveManager.cs</w:t>
             </w:r>
           </w:p>
         </w:tc>
@@ -11610,7 +11988,7 @@
                 <w:sz w:val="18"/>
                 <w:szCs w:val="18"/>
               </w:rPr>
-              <w:t xml:space="preserve">12-slot occupancy; tappable slots; lane / slot ↔ screen position</w:t>
+              <w:t xml:space="preserve">Runs the level's 3–5 waves; spawns enemies or the boss; counts turns in a wave; restores a saved wave</w:t>
             </w:r>
           </w:p>
         </w:tc>
@@ -11717,7 +12095,7 @@
                 <w:sz w:val="17"/>
                 <w:szCs w:val="17"/>
               </w:rPr>
-              <w:t xml:space="preserve">LaneController.cs</w:t>
+              <w:t xml:space="preserve">OxygenPointSystem.cs</w:t>
             </w:r>
           </w:p>
         </w:tc>
@@ -11751,7 +12129,7 @@
                 <w:sz w:val="18"/>
                 <w:szCs w:val="18"/>
               </w:rPr>
-              <w:t xml:space="preserve">Climate result of an attack on an undefended or empty lane</w:t>
+              <w:t xml:space="preserve">Per-turn OP allowance of the wave minus the long-wave penalty, never below 2</w:t>
             </w:r>
           </w:p>
         </w:tc>
@@ -11857,28 +12235,7 @@
                 <w:sz w:val="17"/>
                 <w:szCs w:val="17"/>
               </w:rPr>
-              <w:t xml:space="preserve">DeploySystem.cs</w:t>
-            </w:r>
-            <w:r>
-              <w:rPr>
-                <w:rFonts w:ascii="Arial" w:cs="Arial" w:eastAsia="Arial" w:hAnsi="Arial"/>
-                <w:b w:val="false"/>
-                <w:bCs w:val="false"/>
-                <w:sz w:val="18"/>
-                <w:szCs w:val="18"/>
-              </w:rPr>
-              <w:t xml:space="preserve">, </w:t>
-            </w:r>
-            <w:r>
-              <w:rPr>
-                <w:rFonts w:ascii="Consolas" w:cs="Consolas" w:eastAsia="Consolas" w:hAnsi="Consolas"/>
-                <w:b w:val="false"/>
-                <w:bCs w:val="false"/>
-                <w:color w:val="0D47A1"/>
-                <w:sz w:val="17"/>
-                <w:szCs w:val="17"/>
-              </w:rPr>
-              <w:t xml:space="preserve">UnitFactory.cs</w:t>
+              <w:t xml:space="preserve">TemperatureSystem.cs</w:t>
             </w:r>
           </w:p>
         </w:tc>
@@ -11911,7 +12268,7 @@
                 <w:sz w:val="18"/>
                 <w:szCs w:val="18"/>
               </w:rPr>
-              <w:t xml:space="preserve">Slot and OP checks; builds unit objects at runtime</w:t>
+              <w:t xml:space="preserve">Global temperature from 1.0 °C; loss when it reaches 1.5 °C; tracks the peak for stars</w:t>
             </w:r>
           </w:p>
         </w:tc>
@@ -12018,7 +12375,7 @@
                 <w:sz w:val="17"/>
                 <w:szCs w:val="17"/>
               </w:rPr>
-              <w:t xml:space="preserve">UnitBase.cs</w:t>
+              <w:t xml:space="preserve">GridManager.cs</w:t>
             </w:r>
             <w:r>
               <w:rPr>
@@ -12039,7 +12396,7 @@
                 <w:sz w:val="17"/>
                 <w:szCs w:val="17"/>
               </w:rPr>
-              <w:t xml:space="preserve">AllyUnit.cs</w:t>
+              <w:t xml:space="preserve">BoardSlot.cs</w:t>
             </w:r>
             <w:r>
               <w:rPr>
@@ -12060,7 +12417,7 @@
                 <w:sz w:val="17"/>
                 <w:szCs w:val="17"/>
               </w:rPr>
-              <w:t xml:space="preserve">EnemyUnit.cs</w:t>
+              <w:t xml:space="preserve">IsoBoardLayout.cs</w:t>
             </w:r>
           </w:p>
         </w:tc>
@@ -12094,7 +12451,7 @@
                 <w:sz w:val="18"/>
                 <w:szCs w:val="18"/>
               </w:rPr>
-              <w:t xml:space="preserve">HP, damage, attack / hurt / death animation, lane</w:t>
+              <w:t xml:space="preserve">12-slot occupancy; tappable slots; lane / slot ↔ screen position</w:t>
             </w:r>
           </w:p>
         </w:tc>
@@ -12200,7 +12557,7 @@
                 <w:sz w:val="17"/>
                 <w:szCs w:val="17"/>
               </w:rPr>
-              <w:t xml:space="preserve">EnemyAI.cs</w:t>
+              <w:t xml:space="preserve">LaneController.cs</w:t>
             </w:r>
           </w:p>
         </w:tc>
@@ -12233,7 +12590,7 @@
                 <w:sz w:val="18"/>
                 <w:szCs w:val="18"/>
               </w:rPr>
-              <w:t xml:space="preserve">Enemy movement between free enemy slots (state machine)</w:t>
+              <w:t xml:space="preserve">Climate result of an attack on an undefended or empty lane</w:t>
             </w:r>
           </w:p>
         </w:tc>
@@ -12266,7 +12623,7 @@
                 <w:sz w:val="18"/>
                 <w:szCs w:val="18"/>
               </w:rPr>
-              <w:t xml:space="preserve">Planned</w:t>
+              <w:t xml:space="preserve">Built</w:t>
             </w:r>
           </w:p>
         </w:tc>
@@ -12340,7 +12697,28 @@
                 <w:sz w:val="17"/>
                 <w:szCs w:val="17"/>
               </w:rPr>
-              <w:t xml:space="preserve">BossUnit.cs</w:t>
+              <w:t xml:space="preserve">DeploySystem.cs</w:t>
+            </w:r>
+            <w:r>
+              <w:rPr>
+                <w:rFonts w:ascii="Arial" w:cs="Arial" w:eastAsia="Arial" w:hAnsi="Arial"/>
+                <w:b w:val="false"/>
+                <w:bCs w:val="false"/>
+                <w:sz w:val="18"/>
+                <w:szCs w:val="18"/>
+              </w:rPr>
+              <w:t xml:space="preserve">, </w:t>
+            </w:r>
+            <w:r>
+              <w:rPr>
+                <w:rFonts w:ascii="Consolas" w:cs="Consolas" w:eastAsia="Consolas" w:hAnsi="Consolas"/>
+                <w:b w:val="false"/>
+                <w:bCs w:val="false"/>
+                <w:color w:val="0D47A1"/>
+                <w:sz w:val="17"/>
+                <w:szCs w:val="17"/>
+              </w:rPr>
+              <w:t xml:space="preserve">UnitFactory.cs</w:t>
             </w:r>
           </w:p>
         </w:tc>
@@ -12374,7 +12752,7 @@
                 <w:sz w:val="18"/>
                 <w:szCs w:val="18"/>
               </w:rPr>
-              <w:t xml:space="preserve">Stage boss: fills all 6 enemy slots; cleave, telegraphed area slam, enrage at 40% HP. One boss per stage</w:t>
+              <w:t xml:space="preserve">Slot and OP checks; builds unit objects at runtime</w:t>
             </w:r>
           </w:p>
         </w:tc>
@@ -12480,7 +12858,7 @@
                 <w:sz w:val="17"/>
                 <w:szCs w:val="17"/>
               </w:rPr>
-              <w:t xml:space="preserve">QuizManager.cs</w:t>
+              <w:t xml:space="preserve">UnitBase.cs</w:t>
             </w:r>
             <w:r>
               <w:rPr>
@@ -12501,7 +12879,7 @@
                 <w:sz w:val="17"/>
                 <w:szCs w:val="17"/>
               </w:rPr>
-              <w:t xml:space="preserve">PopupManager.cs</w:t>
+              <w:t xml:space="preserve">AllyUnit.cs</w:t>
             </w:r>
             <w:r>
               <w:rPr>
@@ -12522,7 +12900,7 @@
                 <w:sz w:val="17"/>
                 <w:szCs w:val="17"/>
               </w:rPr>
-              <w:t xml:space="preserve">ClimateCodex.cs</w:t>
+              <w:t xml:space="preserve">EnemyUnit.cs</w:t>
             </w:r>
           </w:p>
         </w:tc>
@@ -12555,7 +12933,7 @@
                 <w:sz w:val="18"/>
                 <w:szCs w:val="18"/>
               </w:rPr>
-              <w:t xml:space="preserve">Pre / post quizzes and gain; fact pop-ups; fact review</w:t>
+              <w:t xml:space="preserve">HP, damage, attack / hurt / death animation, lane</w:t>
             </w:r>
           </w:p>
         </w:tc>
@@ -12588,7 +12966,7 @@
                 <w:sz w:val="18"/>
                 <w:szCs w:val="18"/>
               </w:rPr>
-              <w:t xml:space="preserve">Planned</w:t>
+              <w:t xml:space="preserve">Built</w:t>
             </w:r>
           </w:p>
         </w:tc>
@@ -12627,7 +13005,7 @@
                 <w:sz w:val="18"/>
                 <w:szCs w:val="18"/>
               </w:rPr>
-              <w:t xml:space="preserve">Data / Persistence</w:t>
+              <w:t xml:space="preserve">Core Logic</w:t>
             </w:r>
           </w:p>
         </w:tc>
@@ -12662,91 +13040,7 @@
                 <w:sz w:val="17"/>
                 <w:szCs w:val="17"/>
               </w:rPr>
-              <w:t xml:space="preserve">StageData.cs</w:t>
-            </w:r>
-            <w:r>
-              <w:rPr>
-                <w:rFonts w:ascii="Arial" w:cs="Arial" w:eastAsia="Arial" w:hAnsi="Arial"/>
-                <w:b w:val="false"/>
-                <w:bCs w:val="false"/>
-                <w:sz w:val="18"/>
-                <w:szCs w:val="18"/>
-              </w:rPr>
-              <w:t xml:space="preserve">, </w:t>
-            </w:r>
-            <w:r>
-              <w:rPr>
-                <w:rFonts w:ascii="Consolas" w:cs="Consolas" w:eastAsia="Consolas" w:hAnsi="Consolas"/>
-                <w:b w:val="false"/>
-                <w:bCs w:val="false"/>
-                <w:color w:val="0D47A1"/>
-                <w:sz w:val="17"/>
-                <w:szCs w:val="17"/>
-              </w:rPr>
-              <w:t xml:space="preserve">LevelData.cs</w:t>
-            </w:r>
-            <w:r>
-              <w:rPr>
-                <w:rFonts w:ascii="Arial" w:cs="Arial" w:eastAsia="Arial" w:hAnsi="Arial"/>
-                <w:b w:val="false"/>
-                <w:bCs w:val="false"/>
-                <w:sz w:val="18"/>
-                <w:szCs w:val="18"/>
-              </w:rPr>
-              <w:t xml:space="preserve">, </w:t>
-            </w:r>
-            <w:r>
-              <w:rPr>
-                <w:rFonts w:ascii="Consolas" w:cs="Consolas" w:eastAsia="Consolas" w:hAnsi="Consolas"/>
-                <w:b w:val="false"/>
-                <w:bCs w:val="false"/>
-                <w:color w:val="0D47A1"/>
-                <w:sz w:val="17"/>
-                <w:szCs w:val="17"/>
-              </w:rPr>
-              <w:t xml:space="preserve">WaveData.cs</w:t>
-            </w:r>
-            <w:r>
-              <w:rPr>
-                <w:rFonts w:ascii="Arial" w:cs="Arial" w:eastAsia="Arial" w:hAnsi="Arial"/>
-                <w:b w:val="false"/>
-                <w:bCs w:val="false"/>
-                <w:sz w:val="18"/>
-                <w:szCs w:val="18"/>
-              </w:rPr>
-              <w:t xml:space="preserve">, </w:t>
-            </w:r>
-            <w:r>
-              <w:rPr>
-                <w:rFonts w:ascii="Consolas" w:cs="Consolas" w:eastAsia="Consolas" w:hAnsi="Consolas"/>
-                <w:b w:val="false"/>
-                <w:bCs w:val="false"/>
-                <w:color w:val="0D47A1"/>
-                <w:sz w:val="17"/>
-                <w:szCs w:val="17"/>
-              </w:rPr>
-              <w:t xml:space="preserve">UnitData.cs</w:t>
-            </w:r>
-            <w:r>
-              <w:rPr>
-                <w:rFonts w:ascii="Arial" w:cs="Arial" w:eastAsia="Arial" w:hAnsi="Arial"/>
-                <w:b w:val="false"/>
-                <w:bCs w:val="false"/>
-                <w:sz w:val="18"/>
-                <w:szCs w:val="18"/>
-              </w:rPr>
-              <w:t xml:space="preserve">, </w:t>
-            </w:r>
-            <w:r>
-              <w:rPr>
-                <w:rFonts w:ascii="Consolas" w:cs="Consolas" w:eastAsia="Consolas" w:hAnsi="Consolas"/>
-                <w:b w:val="false"/>
-                <w:bCs w:val="false"/>
-                <w:color w:val="0D47A1"/>
-                <w:sz w:val="17"/>
-                <w:szCs w:val="17"/>
-              </w:rPr>
-              <w:t xml:space="preserve">BossData.cs</w:t>
+              <w:t xml:space="preserve">EnemyAI.cs</w:t>
             </w:r>
           </w:p>
         </w:tc>
@@ -12780,7 +13074,7 @@
                 <w:sz w:val="18"/>
                 <w:szCs w:val="18"/>
               </w:rPr>
-              <w:t xml:space="preserve">Read-only game content (ScriptableObjects)</w:t>
+              <w:t xml:space="preserve">Enemy movement between free enemy slots (state machine)</w:t>
             </w:r>
           </w:p>
         </w:tc>
@@ -12814,7 +13108,7 @@
                 <w:sz w:val="18"/>
                 <w:szCs w:val="18"/>
               </w:rPr>
-              <w:t xml:space="preserve">Built</w:t>
+              <w:t xml:space="preserve">Planned</w:t>
             </w:r>
           </w:p>
         </w:tc>
@@ -12852,7 +13146,7 @@
                 <w:sz w:val="18"/>
                 <w:szCs w:val="18"/>
               </w:rPr>
-              <w:t xml:space="preserve">Data / Persistence</w:t>
+              <w:t xml:space="preserve">Core Logic</w:t>
             </w:r>
           </w:p>
         </w:tc>
@@ -12886,28 +13180,7 @@
                 <w:sz w:val="17"/>
                 <w:szCs w:val="17"/>
               </w:rPr>
-              <w:t xml:space="preserve">QuizData.cs</w:t>
-            </w:r>
-            <w:r>
-              <w:rPr>
-                <w:rFonts w:ascii="Arial" w:cs="Arial" w:eastAsia="Arial" w:hAnsi="Arial"/>
-                <w:b w:val="false"/>
-                <w:bCs w:val="false"/>
-                <w:sz w:val="18"/>
-                <w:szCs w:val="18"/>
-              </w:rPr>
-              <w:t xml:space="preserve">, </w:t>
-            </w:r>
-            <w:r>
-              <w:rPr>
-                <w:rFonts w:ascii="Consolas" w:cs="Consolas" w:eastAsia="Consolas" w:hAnsi="Consolas"/>
-                <w:b w:val="false"/>
-                <w:bCs w:val="false"/>
-                <w:color w:val="0D47A1"/>
-                <w:sz w:val="17"/>
-                <w:szCs w:val="17"/>
-              </w:rPr>
-              <w:t xml:space="preserve">PopupData.cs</w:t>
+              <w:t xml:space="preserve">BossUnit.cs</w:t>
             </w:r>
           </w:p>
         </w:tc>
@@ -12940,7 +13213,7 @@
                 <w:sz w:val="18"/>
                 <w:szCs w:val="18"/>
               </w:rPr>
-              <w:t xml:space="preserve">Read-only quiz and fact content</w:t>
+              <w:t xml:space="preserve">Stage boss: fills all 6 enemy slots; cleave, telegraphed area slam, enrage at 40% HP. One boss per stage</w:t>
             </w:r>
           </w:p>
         </w:tc>
@@ -12973,7 +13246,7 @@
                 <w:sz w:val="18"/>
                 <w:szCs w:val="18"/>
               </w:rPr>
-              <w:t xml:space="preserve">Planned</w:t>
+              <w:t xml:space="preserve">Built</w:t>
             </w:r>
           </w:p>
         </w:tc>
@@ -13012,7 +13285,7 @@
                 <w:sz w:val="18"/>
                 <w:szCs w:val="18"/>
               </w:rPr>
-              <w:t xml:space="preserve">Data / Persistence</w:t>
+              <w:t xml:space="preserve">Core Logic</w:t>
             </w:r>
           </w:p>
         </w:tc>
@@ -13047,7 +13320,49 @@
                 <w:sz w:val="17"/>
                 <w:szCs w:val="17"/>
               </w:rPr>
-              <w:t xml:space="preserve">ResultsDatabase.cs</w:t>
+              <w:t xml:space="preserve">QuizManager.cs</w:t>
+            </w:r>
+            <w:r>
+              <w:rPr>
+                <w:rFonts w:ascii="Arial" w:cs="Arial" w:eastAsia="Arial" w:hAnsi="Arial"/>
+                <w:b w:val="false"/>
+                <w:bCs w:val="false"/>
+                <w:sz w:val="18"/>
+                <w:szCs w:val="18"/>
+              </w:rPr>
+              <w:t xml:space="preserve">, </w:t>
+            </w:r>
+            <w:r>
+              <w:rPr>
+                <w:rFonts w:ascii="Consolas" w:cs="Consolas" w:eastAsia="Consolas" w:hAnsi="Consolas"/>
+                <w:b w:val="false"/>
+                <w:bCs w:val="false"/>
+                <w:color w:val="0D47A1"/>
+                <w:sz w:val="17"/>
+                <w:szCs w:val="17"/>
+              </w:rPr>
+              <w:t xml:space="preserve">PopupManager.cs</w:t>
+            </w:r>
+            <w:r>
+              <w:rPr>
+                <w:rFonts w:ascii="Arial" w:cs="Arial" w:eastAsia="Arial" w:hAnsi="Arial"/>
+                <w:b w:val="false"/>
+                <w:bCs w:val="false"/>
+                <w:sz w:val="18"/>
+                <w:szCs w:val="18"/>
+              </w:rPr>
+              <w:t xml:space="preserve">, </w:t>
+            </w:r>
+            <w:r>
+              <w:rPr>
+                <w:rFonts w:ascii="Consolas" w:cs="Consolas" w:eastAsia="Consolas" w:hAnsi="Consolas"/>
+                <w:b w:val="false"/>
+                <w:bCs w:val="false"/>
+                <w:color w:val="0D47A1"/>
+                <w:sz w:val="17"/>
+                <w:szCs w:val="17"/>
+              </w:rPr>
+              <w:t xml:space="preserve">ClimateCodex.cs</w:t>
             </w:r>
           </w:p>
         </w:tc>
@@ -13081,28 +13396,7 @@
                 <w:sz w:val="18"/>
                 <w:szCs w:val="18"/>
               </w:rPr>
-              <w:t xml:space="preserve">Only script that opens </w:t>
-            </w:r>
-            <w:r>
-              <w:rPr>
-                <w:rFonts w:ascii="Consolas" w:cs="Consolas" w:eastAsia="Consolas" w:hAnsi="Consolas"/>
-                <w:b w:val="false"/>
-                <w:bCs w:val="false"/>
-                <w:color w:val="0D47A1"/>
-                <w:sz w:val="17"/>
-                <w:szCs w:val="17"/>
-              </w:rPr>
-              <w:t xml:space="preserve">thermo_tactics.db</w:t>
-            </w:r>
-            <w:r>
-              <w:rPr>
-                <w:rFonts w:ascii="Arial" w:cs="Arial" w:eastAsia="Arial" w:hAnsi="Arial"/>
-                <w:b w:val="false"/>
-                <w:bCs w:val="false"/>
-                <w:sz w:val="18"/>
-                <w:szCs w:val="18"/>
-              </w:rPr>
-              <w:t xml:space="preserve">; results, level progress and the saved game</w:t>
+              <w:t xml:space="preserve">Pre / post quizzes and gain; fact pop-ups; fact review</w:t>
             </w:r>
           </w:p>
         </w:tc>
@@ -13136,7 +13430,7 @@
                 <w:sz w:val="18"/>
                 <w:szCs w:val="18"/>
               </w:rPr>
-              <w:t xml:space="preserve">Built</w:t>
+              <w:t xml:space="preserve">Planned</w:t>
             </w:r>
           </w:p>
         </w:tc>
@@ -13208,7 +13502,91 @@
                 <w:sz w:val="17"/>
                 <w:szCs w:val="17"/>
               </w:rPr>
-              <w:t xml:space="preserve">SessionSnapshot.cs</w:t>
+              <w:t xml:space="preserve">StageData.cs</w:t>
+            </w:r>
+            <w:r>
+              <w:rPr>
+                <w:rFonts w:ascii="Arial" w:cs="Arial" w:eastAsia="Arial" w:hAnsi="Arial"/>
+                <w:b w:val="false"/>
+                <w:bCs w:val="false"/>
+                <w:sz w:val="18"/>
+                <w:szCs w:val="18"/>
+              </w:rPr>
+              <w:t xml:space="preserve">, </w:t>
+            </w:r>
+            <w:r>
+              <w:rPr>
+                <w:rFonts w:ascii="Consolas" w:cs="Consolas" w:eastAsia="Consolas" w:hAnsi="Consolas"/>
+                <w:b w:val="false"/>
+                <w:bCs w:val="false"/>
+                <w:color w:val="0D47A1"/>
+                <w:sz w:val="17"/>
+                <w:szCs w:val="17"/>
+              </w:rPr>
+              <w:t xml:space="preserve">LevelData.cs</w:t>
+            </w:r>
+            <w:r>
+              <w:rPr>
+                <w:rFonts w:ascii="Arial" w:cs="Arial" w:eastAsia="Arial" w:hAnsi="Arial"/>
+                <w:b w:val="false"/>
+                <w:bCs w:val="false"/>
+                <w:sz w:val="18"/>
+                <w:szCs w:val="18"/>
+              </w:rPr>
+              <w:t xml:space="preserve">, </w:t>
+            </w:r>
+            <w:r>
+              <w:rPr>
+                <w:rFonts w:ascii="Consolas" w:cs="Consolas" w:eastAsia="Consolas" w:hAnsi="Consolas"/>
+                <w:b w:val="false"/>
+                <w:bCs w:val="false"/>
+                <w:color w:val="0D47A1"/>
+                <w:sz w:val="17"/>
+                <w:szCs w:val="17"/>
+              </w:rPr>
+              <w:t xml:space="preserve">WaveData.cs</w:t>
+            </w:r>
+            <w:r>
+              <w:rPr>
+                <w:rFonts w:ascii="Arial" w:cs="Arial" w:eastAsia="Arial" w:hAnsi="Arial"/>
+                <w:b w:val="false"/>
+                <w:bCs w:val="false"/>
+                <w:sz w:val="18"/>
+                <w:szCs w:val="18"/>
+              </w:rPr>
+              <w:t xml:space="preserve">, </w:t>
+            </w:r>
+            <w:r>
+              <w:rPr>
+                <w:rFonts w:ascii="Consolas" w:cs="Consolas" w:eastAsia="Consolas" w:hAnsi="Consolas"/>
+                <w:b w:val="false"/>
+                <w:bCs w:val="false"/>
+                <w:color w:val="0D47A1"/>
+                <w:sz w:val="17"/>
+                <w:szCs w:val="17"/>
+              </w:rPr>
+              <w:t xml:space="preserve">UnitData.cs</w:t>
+            </w:r>
+            <w:r>
+              <w:rPr>
+                <w:rFonts w:ascii="Arial" w:cs="Arial" w:eastAsia="Arial" w:hAnsi="Arial"/>
+                <w:b w:val="false"/>
+                <w:bCs w:val="false"/>
+                <w:sz w:val="18"/>
+                <w:szCs w:val="18"/>
+              </w:rPr>
+              <w:t xml:space="preserve">, </w:t>
+            </w:r>
+            <w:r>
+              <w:rPr>
+                <w:rFonts w:ascii="Consolas" w:cs="Consolas" w:eastAsia="Consolas" w:hAnsi="Consolas"/>
+                <w:b w:val="false"/>
+                <w:bCs w:val="false"/>
+                <w:color w:val="0D47A1"/>
+                <w:sz w:val="17"/>
+                <w:szCs w:val="17"/>
+              </w:rPr>
+              <w:t xml:space="preserve">BossData.cs</w:t>
             </w:r>
           </w:p>
         </w:tc>
@@ -13241,7 +13619,7 @@
                 <w:sz w:val="18"/>
                 <w:szCs w:val="18"/>
               </w:rPr>
-              <w:t xml:space="preserve">The saved game behind Continue: stage, level, wave, turn, Oxygen, temperature and every unit on the board</w:t>
+              <w:t xml:space="preserve">Read-only game content (ScriptableObjects)</w:t>
             </w:r>
           </w:p>
         </w:tc>
@@ -13348,7 +13726,28 @@
                 <w:sz w:val="17"/>
                 <w:szCs w:val="17"/>
               </w:rPr>
-              <w:t xml:space="preserve">QuizResultExporter.cs</w:t>
+              <w:t xml:space="preserve">QuizData.cs</w:t>
+            </w:r>
+            <w:r>
+              <w:rPr>
+                <w:rFonts w:ascii="Arial" w:cs="Arial" w:eastAsia="Arial" w:hAnsi="Arial"/>
+                <w:b w:val="false"/>
+                <w:bCs w:val="false"/>
+                <w:sz w:val="18"/>
+                <w:szCs w:val="18"/>
+              </w:rPr>
+              <w:t xml:space="preserve">, </w:t>
+            </w:r>
+            <w:r>
+              <w:rPr>
+                <w:rFonts w:ascii="Consolas" w:cs="Consolas" w:eastAsia="Consolas" w:hAnsi="Consolas"/>
+                <w:b w:val="false"/>
+                <w:bCs w:val="false"/>
+                <w:color w:val="0D47A1"/>
+                <w:sz w:val="17"/>
+                <w:szCs w:val="17"/>
+              </w:rPr>
+              <w:t xml:space="preserve">PopupData.cs</w:t>
             </w:r>
           </w:p>
         </w:tc>
@@ -13382,7 +13781,7 @@
                 <w:sz w:val="18"/>
                 <w:szCs w:val="18"/>
               </w:rPr>
-              <w:t xml:space="preserve">Writes the quiz-results CSV to shared storage</w:t>
+              <w:t xml:space="preserve">Read-only quiz and fact content</w:t>
             </w:r>
           </w:p>
         </w:tc>
@@ -13454,7 +13853,7 @@
                 <w:sz w:val="18"/>
                 <w:szCs w:val="18"/>
               </w:rPr>
-              <w:t xml:space="preserve">Local Storage</w:t>
+              <w:t xml:space="preserve">Data / Persistence</w:t>
             </w:r>
           </w:p>
         </w:tc>
@@ -13488,6 +13887,50 @@
                 <w:sz w:val="17"/>
                 <w:szCs w:val="17"/>
               </w:rPr>
+              <w:t xml:space="preserve">ResultsDatabase.cs</w:t>
+            </w:r>
+          </w:p>
+        </w:tc>
+        <w:tc>
+          <w:tcPr>
+            <w:tcW w:type="dxa" w:w="4280"/>
+            <w:tcBorders>
+              <w:top w:val="single" w:color="B0BEC5" w:sz="4"/>
+              <w:left w:val="single" w:color="B0BEC5" w:sz="4"/>
+              <w:bottom w:val="single" w:color="B0BEC5" w:sz="4"/>
+              <w:right w:val="single" w:color="B0BEC5" w:sz="4"/>
+            </w:tcBorders>
+            <w:tcMar>
+              <w:top w:type="dxa" w:w="60"/>
+              <w:left w:type="dxa" w:w="100"/>
+              <w:bottom w:type="dxa" w:w="60"/>
+              <w:right w:type="dxa" w:w="100"/>
+            </w:tcMar>
+            <w:vAlign w:val="top"/>
+          </w:tcPr>
+          <w:p>
+            <w:pPr>
+              <w:spacing w:after="30" w:line="252"/>
+            </w:pPr>
+            <w:r>
+              <w:rPr>
+                <w:rFonts w:ascii="Arial" w:cs="Arial" w:eastAsia="Arial" w:hAnsi="Arial"/>
+                <w:b w:val="false"/>
+                <w:bCs w:val="false"/>
+                <w:sz w:val="18"/>
+                <w:szCs w:val="18"/>
+              </w:rPr>
+              <w:t xml:space="preserve">Only script that opens </w:t>
+            </w:r>
+            <w:r>
+              <w:rPr>
+                <w:rFonts w:ascii="Consolas" w:cs="Consolas" w:eastAsia="Consolas" w:hAnsi="Consolas"/>
+                <w:b w:val="false"/>
+                <w:bCs w:val="false"/>
+                <w:color w:val="0D47A1"/>
+                <w:sz w:val="17"/>
+                <w:szCs w:val="17"/>
+              </w:rPr>
               <w:t xml:space="preserve">thermo_tactics.db</w:t>
             </w:r>
             <w:r>
@@ -13498,114 +13941,7 @@
                 <w:sz w:val="18"/>
                 <w:szCs w:val="18"/>
               </w:rPr>
-              <w:t xml:space="preserve"> (SQLite)</w:t>
-            </w:r>
-          </w:p>
-        </w:tc>
-        <w:tc>
-          <w:tcPr>
-            <w:tcW w:type="dxa" w:w="4280"/>
-            <w:tcBorders>
-              <w:top w:val="single" w:color="B0BEC5" w:sz="4"/>
-              <w:left w:val="single" w:color="B0BEC5" w:sz="4"/>
-              <w:bottom w:val="single" w:color="B0BEC5" w:sz="4"/>
-              <w:right w:val="single" w:color="B0BEC5" w:sz="4"/>
-            </w:tcBorders>
-            <w:tcMar>
-              <w:top w:type="dxa" w:w="60"/>
-              <w:left w:type="dxa" w:w="100"/>
-              <w:bottom w:type="dxa" w:w="60"/>
-              <w:right w:type="dxa" w:w="100"/>
-            </w:tcMar>
-            <w:vAlign w:val="top"/>
-          </w:tcPr>
-          <w:p>
-            <w:pPr>
-              <w:spacing w:after="30" w:line="252"/>
-            </w:pPr>
-            <w:r>
-              <w:rPr>
-                <w:rFonts w:ascii="Consolas" w:cs="Consolas" w:eastAsia="Consolas" w:hAnsi="Consolas"/>
-                <w:b w:val="false"/>
-                <w:bCs w:val="false"/>
-                <w:color w:val="0D47A1"/>
-                <w:sz w:val="17"/>
-                <w:szCs w:val="17"/>
-              </w:rPr>
-              <w:t xml:space="preserve">game_results</w:t>
-            </w:r>
-            <w:r>
-              <w:rPr>
-                <w:rFonts w:ascii="Arial" w:cs="Arial" w:eastAsia="Arial" w:hAnsi="Arial"/>
-                <w:b w:val="false"/>
-                <w:bCs w:val="false"/>
-                <w:sz w:val="18"/>
-                <w:szCs w:val="18"/>
-              </w:rPr>
-              <w:t xml:space="preserve">, </w:t>
-            </w:r>
-            <w:r>
-              <w:rPr>
-                <w:rFonts w:ascii="Consolas" w:cs="Consolas" w:eastAsia="Consolas" w:hAnsi="Consolas"/>
-                <w:b w:val="false"/>
-                <w:bCs w:val="false"/>
-                <w:color w:val="0D47A1"/>
-                <w:sz w:val="17"/>
-                <w:szCs w:val="17"/>
-              </w:rPr>
-              <w:t xml:space="preserve">level_progress</w:t>
-            </w:r>
-            <w:r>
-              <w:rPr>
-                <w:rFonts w:ascii="Arial" w:cs="Arial" w:eastAsia="Arial" w:hAnsi="Arial"/>
-                <w:b w:val="false"/>
-                <w:bCs w:val="false"/>
-                <w:sz w:val="18"/>
-                <w:szCs w:val="18"/>
-              </w:rPr>
-              <w:t xml:space="preserve">, </w:t>
-            </w:r>
-            <w:r>
-              <w:rPr>
-                <w:rFonts w:ascii="Consolas" w:cs="Consolas" w:eastAsia="Consolas" w:hAnsi="Consolas"/>
-                <w:b w:val="false"/>
-                <w:bCs w:val="false"/>
-                <w:color w:val="0D47A1"/>
-                <w:sz w:val="17"/>
-                <w:szCs w:val="17"/>
-              </w:rPr>
-              <w:t xml:space="preserve">saved_session</w:t>
-            </w:r>
-            <w:r>
-              <w:rPr>
-                <w:rFonts w:ascii="Arial" w:cs="Arial" w:eastAsia="Arial" w:hAnsi="Arial"/>
-                <w:b w:val="false"/>
-                <w:bCs w:val="false"/>
-                <w:sz w:val="18"/>
-                <w:szCs w:val="18"/>
-              </w:rPr>
-              <w:t xml:space="preserve"> (built); </w:t>
-            </w:r>
-            <w:r>
-              <w:rPr>
-                <w:rFonts w:ascii="Consolas" w:cs="Consolas" w:eastAsia="Consolas" w:hAnsi="Consolas"/>
-                <w:b w:val="false"/>
-                <w:bCs w:val="false"/>
-                <w:color w:val="0D47A1"/>
-                <w:sz w:val="17"/>
-                <w:szCs w:val="17"/>
-              </w:rPr>
-              <w:t xml:space="preserve">quiz_results</w:t>
-            </w:r>
-            <w:r>
-              <w:rPr>
-                <w:rFonts w:ascii="Arial" w:cs="Arial" w:eastAsia="Arial" w:hAnsi="Arial"/>
-                <w:b w:val="false"/>
-                <w:bCs w:val="false"/>
-                <w:sz w:val="18"/>
-                <w:szCs w:val="18"/>
-              </w:rPr>
-              <w:t xml:space="preserve"> (planned)</w:t>
+              <w:t xml:space="preserve">; results, level progress and the saved game</w:t>
             </w:r>
           </w:p>
         </w:tc>
@@ -13638,7 +13974,7 @@
                 <w:sz w:val="18"/>
                 <w:szCs w:val="18"/>
               </w:rPr>
-              <w:t xml:space="preserve">Built (partly)</w:t>
+              <w:t xml:space="preserve">Built</w:t>
             </w:r>
           </w:p>
         </w:tc>
@@ -13677,7 +14013,7 @@
                 <w:sz w:val="18"/>
                 <w:szCs w:val="18"/>
               </w:rPr>
-              <w:t xml:space="preserve">Local Storage</w:t>
+              <w:t xml:space="preserve">Data / Persistence</w:t>
             </w:r>
           </w:p>
         </w:tc>
@@ -13705,34 +14041,14 @@
             </w:pPr>
             <w:r>
               <w:rPr>
-                <w:rFonts w:ascii="Arial" w:cs="Arial" w:eastAsia="Arial" w:hAnsi="Arial"/>
-                <w:b w:val="false"/>
-                <w:bCs w:val="false"/>
-                <w:sz w:val="18"/>
-                <w:szCs w:val="18"/>
-              </w:rPr>
-              <w:t xml:space="preserve">PlayerPrefs (</w:t>
-            </w:r>
-            <w:r>
-              <w:rPr>
-                <w:rFonts w:ascii="Consolas" w:cs="Consolas" w:eastAsia="Consolas" w:hAnsi="Consolas"/>
-                <w:b w:val="false"/>
-                <w:bCs w:val="false"/>
-                <w:color w:val="0D47A1"/>
-                <w:sz w:val="17"/>
-                <w:szCs w:val="17"/>
-              </w:rPr>
-              <w:t xml:space="preserve">SettingsStore.cs</w:t>
-            </w:r>
-            <w:r>
-              <w:rPr>
-                <w:rFonts w:ascii="Arial" w:cs="Arial" w:eastAsia="Arial" w:hAnsi="Arial"/>
-                <w:b w:val="false"/>
-                <w:bCs w:val="false"/>
-                <w:sz w:val="18"/>
-                <w:szCs w:val="18"/>
-              </w:rPr>
-              <w:t xml:space="preserve">)</w:t>
+                <w:rFonts w:ascii="Consolas" w:cs="Consolas" w:eastAsia="Consolas" w:hAnsi="Consolas"/>
+                <w:b w:val="false"/>
+                <w:bCs w:val="false"/>
+                <w:color w:val="0D47A1"/>
+                <w:sz w:val="17"/>
+                <w:szCs w:val="17"/>
+              </w:rPr>
+              <w:t xml:space="preserve">SessionSnapshot.cs</w:t>
             </w:r>
           </w:p>
         </w:tc>
@@ -13766,7 +14082,7 @@
                 <w:sz w:val="18"/>
                 <w:szCs w:val="18"/>
               </w:rPr>
-              <w:t xml:space="preserve">Settings and the last player name</w:t>
+              <w:t xml:space="preserve">The saved game behind Continue: stage, level, wave, turn, Oxygen, temperature and every unit on the board</w:t>
             </w:r>
           </w:p>
         </w:tc>
@@ -13838,6 +14154,529 @@
                 <w:sz w:val="18"/>
                 <w:szCs w:val="18"/>
               </w:rPr>
+              <w:t xml:space="preserve">Data / Persistence</w:t>
+            </w:r>
+          </w:p>
+        </w:tc>
+        <w:tc>
+          <w:tcPr>
+            <w:tcW w:type="dxa" w:w="2900"/>
+            <w:tcBorders>
+              <w:top w:val="single" w:color="B0BEC5" w:sz="4"/>
+              <w:left w:val="single" w:color="B0BEC5" w:sz="4"/>
+              <w:bottom w:val="single" w:color="B0BEC5" w:sz="4"/>
+              <w:right w:val="single" w:color="B0BEC5" w:sz="4"/>
+            </w:tcBorders>
+            <w:tcMar>
+              <w:top w:type="dxa" w:w="60"/>
+              <w:left w:type="dxa" w:w="100"/>
+              <w:bottom w:type="dxa" w:w="60"/>
+              <w:right w:type="dxa" w:w="100"/>
+            </w:tcMar>
+            <w:vAlign w:val="top"/>
+          </w:tcPr>
+          <w:p>
+            <w:pPr>
+              <w:spacing w:after="30" w:line="252"/>
+            </w:pPr>
+            <w:r>
+              <w:rPr>
+                <w:rFonts w:ascii="Consolas" w:cs="Consolas" w:eastAsia="Consolas" w:hAnsi="Consolas"/>
+                <w:b w:val="false"/>
+                <w:bCs w:val="false"/>
+                <w:color w:val="0D47A1"/>
+                <w:sz w:val="17"/>
+                <w:szCs w:val="17"/>
+              </w:rPr>
+              <w:t xml:space="preserve">QuizResultExporter.cs</w:t>
+            </w:r>
+          </w:p>
+        </w:tc>
+        <w:tc>
+          <w:tcPr>
+            <w:tcW w:type="dxa" w:w="4280"/>
+            <w:tcBorders>
+              <w:top w:val="single" w:color="B0BEC5" w:sz="4"/>
+              <w:left w:val="single" w:color="B0BEC5" w:sz="4"/>
+              <w:bottom w:val="single" w:color="B0BEC5" w:sz="4"/>
+              <w:right w:val="single" w:color="B0BEC5" w:sz="4"/>
+            </w:tcBorders>
+            <w:tcMar>
+              <w:top w:type="dxa" w:w="60"/>
+              <w:left w:type="dxa" w:w="100"/>
+              <w:bottom w:type="dxa" w:w="60"/>
+              <w:right w:type="dxa" w:w="100"/>
+            </w:tcMar>
+            <w:vAlign w:val="top"/>
+          </w:tcPr>
+          <w:p>
+            <w:pPr>
+              <w:spacing w:after="30" w:line="252"/>
+            </w:pPr>
+            <w:r>
+              <w:rPr>
+                <w:rFonts w:ascii="Arial" w:cs="Arial" w:eastAsia="Arial" w:hAnsi="Arial"/>
+                <w:b w:val="false"/>
+                <w:bCs w:val="false"/>
+                <w:sz w:val="18"/>
+                <w:szCs w:val="18"/>
+              </w:rPr>
+              <w:t xml:space="preserve">Writes the quiz-results CSV to shared storage</w:t>
+            </w:r>
+          </w:p>
+        </w:tc>
+        <w:tc>
+          <w:tcPr>
+            <w:tcW w:type="dxa" w:w="1400"/>
+            <w:tcBorders>
+              <w:top w:val="single" w:color="B0BEC5" w:sz="4"/>
+              <w:left w:val="single" w:color="B0BEC5" w:sz="4"/>
+              <w:bottom w:val="single" w:color="B0BEC5" w:sz="4"/>
+              <w:right w:val="single" w:color="B0BEC5" w:sz="4"/>
+            </w:tcBorders>
+            <w:tcMar>
+              <w:top w:type="dxa" w:w="60"/>
+              <w:left w:type="dxa" w:w="100"/>
+              <w:bottom w:type="dxa" w:w="60"/>
+              <w:right w:type="dxa" w:w="100"/>
+            </w:tcMar>
+            <w:vAlign w:val="top"/>
+          </w:tcPr>
+          <w:p>
+            <w:pPr>
+              <w:spacing w:after="30" w:line="252"/>
+            </w:pPr>
+            <w:r>
+              <w:rPr>
+                <w:rFonts w:ascii="Arial" w:cs="Arial" w:eastAsia="Arial" w:hAnsi="Arial"/>
+                <w:b w:val="false"/>
+                <w:bCs w:val="false"/>
+                <w:sz w:val="18"/>
+                <w:szCs w:val="18"/>
+              </w:rPr>
+              <w:t xml:space="preserve">Planned</w:t>
+            </w:r>
+          </w:p>
+        </w:tc>
+      </w:tr>
+      <w:tr>
+        <w:trPr>
+          <w:cantSplit/>
+        </w:trPr>
+        <w:tc>
+          <w:tcPr>
+            <w:tcW w:type="dxa" w:w="1500"/>
+            <w:tcBorders>
+              <w:top w:val="single" w:color="B0BEC5" w:sz="4"/>
+              <w:left w:val="single" w:color="B0BEC5" w:sz="4"/>
+              <w:bottom w:val="single" w:color="B0BEC5" w:sz="4"/>
+              <w:right w:val="single" w:color="B0BEC5" w:sz="4"/>
+            </w:tcBorders>
+            <w:shd w:fill="F5F8FC" w:color="auto" w:val="clear"/>
+            <w:tcMar>
+              <w:top w:type="dxa" w:w="60"/>
+              <w:left w:type="dxa" w:w="100"/>
+              <w:bottom w:type="dxa" w:w="60"/>
+              <w:right w:type="dxa" w:w="100"/>
+            </w:tcMar>
+            <w:vAlign w:val="top"/>
+          </w:tcPr>
+          <w:p>
+            <w:pPr>
+              <w:spacing w:after="30" w:line="252"/>
+            </w:pPr>
+            <w:r>
+              <w:rPr>
+                <w:rFonts w:ascii="Arial" w:cs="Arial" w:eastAsia="Arial" w:hAnsi="Arial"/>
+                <w:b w:val="false"/>
+                <w:bCs w:val="false"/>
+                <w:sz w:val="18"/>
+                <w:szCs w:val="18"/>
+              </w:rPr>
+              <w:t xml:space="preserve">Local Storage</w:t>
+            </w:r>
+          </w:p>
+        </w:tc>
+        <w:tc>
+          <w:tcPr>
+            <w:tcW w:type="dxa" w:w="2900"/>
+            <w:tcBorders>
+              <w:top w:val="single" w:color="B0BEC5" w:sz="4"/>
+              <w:left w:val="single" w:color="B0BEC5" w:sz="4"/>
+              <w:bottom w:val="single" w:color="B0BEC5" w:sz="4"/>
+              <w:right w:val="single" w:color="B0BEC5" w:sz="4"/>
+            </w:tcBorders>
+            <w:shd w:fill="F5F8FC" w:color="auto" w:val="clear"/>
+            <w:tcMar>
+              <w:top w:type="dxa" w:w="60"/>
+              <w:left w:type="dxa" w:w="100"/>
+              <w:bottom w:type="dxa" w:w="60"/>
+              <w:right w:type="dxa" w:w="100"/>
+            </w:tcMar>
+            <w:vAlign w:val="top"/>
+          </w:tcPr>
+          <w:p>
+            <w:pPr>
+              <w:spacing w:after="30" w:line="252"/>
+            </w:pPr>
+            <w:r>
+              <w:rPr>
+                <w:rFonts w:ascii="Consolas" w:cs="Consolas" w:eastAsia="Consolas" w:hAnsi="Consolas"/>
+                <w:b w:val="false"/>
+                <w:bCs w:val="false"/>
+                <w:color w:val="0D47A1"/>
+                <w:sz w:val="17"/>
+                <w:szCs w:val="17"/>
+              </w:rPr>
+              <w:t xml:space="preserve">thermo_tactics.db</w:t>
+            </w:r>
+            <w:r>
+              <w:rPr>
+                <w:rFonts w:ascii="Arial" w:cs="Arial" w:eastAsia="Arial" w:hAnsi="Arial"/>
+                <w:b w:val="false"/>
+                <w:bCs w:val="false"/>
+                <w:sz w:val="18"/>
+                <w:szCs w:val="18"/>
+              </w:rPr>
+              <w:t xml:space="preserve"> (SQLite)</w:t>
+            </w:r>
+          </w:p>
+        </w:tc>
+        <w:tc>
+          <w:tcPr>
+            <w:tcW w:type="dxa" w:w="4280"/>
+            <w:tcBorders>
+              <w:top w:val="single" w:color="B0BEC5" w:sz="4"/>
+              <w:left w:val="single" w:color="B0BEC5" w:sz="4"/>
+              <w:bottom w:val="single" w:color="B0BEC5" w:sz="4"/>
+              <w:right w:val="single" w:color="B0BEC5" w:sz="4"/>
+            </w:tcBorders>
+            <w:shd w:fill="F5F8FC" w:color="auto" w:val="clear"/>
+            <w:tcMar>
+              <w:top w:type="dxa" w:w="60"/>
+              <w:left w:type="dxa" w:w="100"/>
+              <w:bottom w:type="dxa" w:w="60"/>
+              <w:right w:type="dxa" w:w="100"/>
+            </w:tcMar>
+            <w:vAlign w:val="top"/>
+          </w:tcPr>
+          <w:p>
+            <w:pPr>
+              <w:spacing w:after="30" w:line="252"/>
+            </w:pPr>
+            <w:r>
+              <w:rPr>
+                <w:rFonts w:ascii="Consolas" w:cs="Consolas" w:eastAsia="Consolas" w:hAnsi="Consolas"/>
+                <w:b w:val="false"/>
+                <w:bCs w:val="false"/>
+                <w:color w:val="0D47A1"/>
+                <w:sz w:val="17"/>
+                <w:szCs w:val="17"/>
+              </w:rPr>
+              <w:t xml:space="preserve">game_results</w:t>
+            </w:r>
+            <w:r>
+              <w:rPr>
+                <w:rFonts w:ascii="Arial" w:cs="Arial" w:eastAsia="Arial" w:hAnsi="Arial"/>
+                <w:b w:val="false"/>
+                <w:bCs w:val="false"/>
+                <w:sz w:val="18"/>
+                <w:szCs w:val="18"/>
+              </w:rPr>
+              <w:t xml:space="preserve">, </w:t>
+            </w:r>
+            <w:r>
+              <w:rPr>
+                <w:rFonts w:ascii="Consolas" w:cs="Consolas" w:eastAsia="Consolas" w:hAnsi="Consolas"/>
+                <w:b w:val="false"/>
+                <w:bCs w:val="false"/>
+                <w:color w:val="0D47A1"/>
+                <w:sz w:val="17"/>
+                <w:szCs w:val="17"/>
+              </w:rPr>
+              <w:t xml:space="preserve">level_progress</w:t>
+            </w:r>
+            <w:r>
+              <w:rPr>
+                <w:rFonts w:ascii="Arial" w:cs="Arial" w:eastAsia="Arial" w:hAnsi="Arial"/>
+                <w:b w:val="false"/>
+                <w:bCs w:val="false"/>
+                <w:sz w:val="18"/>
+                <w:szCs w:val="18"/>
+              </w:rPr>
+              <w:t xml:space="preserve">, </w:t>
+            </w:r>
+            <w:r>
+              <w:rPr>
+                <w:rFonts w:ascii="Consolas" w:cs="Consolas" w:eastAsia="Consolas" w:hAnsi="Consolas"/>
+                <w:b w:val="false"/>
+                <w:bCs w:val="false"/>
+                <w:color w:val="0D47A1"/>
+                <w:sz w:val="17"/>
+                <w:szCs w:val="17"/>
+              </w:rPr>
+              <w:t xml:space="preserve">saved_session</w:t>
+            </w:r>
+            <w:r>
+              <w:rPr>
+                <w:rFonts w:ascii="Arial" w:cs="Arial" w:eastAsia="Arial" w:hAnsi="Arial"/>
+                <w:b w:val="false"/>
+                <w:bCs w:val="false"/>
+                <w:sz w:val="18"/>
+                <w:szCs w:val="18"/>
+              </w:rPr>
+              <w:t xml:space="preserve"> (built); </w:t>
+            </w:r>
+            <w:r>
+              <w:rPr>
+                <w:rFonts w:ascii="Consolas" w:cs="Consolas" w:eastAsia="Consolas" w:hAnsi="Consolas"/>
+                <w:b w:val="false"/>
+                <w:bCs w:val="false"/>
+                <w:color w:val="0D47A1"/>
+                <w:sz w:val="17"/>
+                <w:szCs w:val="17"/>
+              </w:rPr>
+              <w:t xml:space="preserve">quiz_results</w:t>
+            </w:r>
+            <w:r>
+              <w:rPr>
+                <w:rFonts w:ascii="Arial" w:cs="Arial" w:eastAsia="Arial" w:hAnsi="Arial"/>
+                <w:b w:val="false"/>
+                <w:bCs w:val="false"/>
+                <w:sz w:val="18"/>
+                <w:szCs w:val="18"/>
+              </w:rPr>
+              <w:t xml:space="preserve"> (planned)</w:t>
+            </w:r>
+          </w:p>
+        </w:tc>
+        <w:tc>
+          <w:tcPr>
+            <w:tcW w:type="dxa" w:w="1400"/>
+            <w:tcBorders>
+              <w:top w:val="single" w:color="B0BEC5" w:sz="4"/>
+              <w:left w:val="single" w:color="B0BEC5" w:sz="4"/>
+              <w:bottom w:val="single" w:color="B0BEC5" w:sz="4"/>
+              <w:right w:val="single" w:color="B0BEC5" w:sz="4"/>
+            </w:tcBorders>
+            <w:shd w:fill="F5F8FC" w:color="auto" w:val="clear"/>
+            <w:tcMar>
+              <w:top w:type="dxa" w:w="60"/>
+              <w:left w:type="dxa" w:w="100"/>
+              <w:bottom w:type="dxa" w:w="60"/>
+              <w:right w:type="dxa" w:w="100"/>
+            </w:tcMar>
+            <w:vAlign w:val="top"/>
+          </w:tcPr>
+          <w:p>
+            <w:pPr>
+              <w:spacing w:after="30" w:line="252"/>
+            </w:pPr>
+            <w:r>
+              <w:rPr>
+                <w:rFonts w:ascii="Arial" w:cs="Arial" w:eastAsia="Arial" w:hAnsi="Arial"/>
+                <w:b w:val="false"/>
+                <w:bCs w:val="false"/>
+                <w:sz w:val="18"/>
+                <w:szCs w:val="18"/>
+              </w:rPr>
+              <w:t xml:space="preserve">Built (partly)</w:t>
+            </w:r>
+          </w:p>
+        </w:tc>
+      </w:tr>
+      <w:tr>
+        <w:trPr>
+          <w:cantSplit/>
+        </w:trPr>
+        <w:tc>
+          <w:tcPr>
+            <w:tcW w:type="dxa" w:w="1500"/>
+            <w:tcBorders>
+              <w:top w:val="single" w:color="B0BEC5" w:sz="4"/>
+              <w:left w:val="single" w:color="B0BEC5" w:sz="4"/>
+              <w:bottom w:val="single" w:color="B0BEC5" w:sz="4"/>
+              <w:right w:val="single" w:color="B0BEC5" w:sz="4"/>
+            </w:tcBorders>
+            <w:tcMar>
+              <w:top w:type="dxa" w:w="60"/>
+              <w:left w:type="dxa" w:w="100"/>
+              <w:bottom w:type="dxa" w:w="60"/>
+              <w:right w:type="dxa" w:w="100"/>
+            </w:tcMar>
+            <w:vAlign w:val="top"/>
+          </w:tcPr>
+          <w:p>
+            <w:pPr>
+              <w:spacing w:after="30" w:line="252"/>
+            </w:pPr>
+            <w:r>
+              <w:rPr>
+                <w:rFonts w:ascii="Arial" w:cs="Arial" w:eastAsia="Arial" w:hAnsi="Arial"/>
+                <w:b w:val="false"/>
+                <w:bCs w:val="false"/>
+                <w:sz w:val="18"/>
+                <w:szCs w:val="18"/>
+              </w:rPr>
+              <w:t xml:space="preserve">Local Storage</w:t>
+            </w:r>
+          </w:p>
+        </w:tc>
+        <w:tc>
+          <w:tcPr>
+            <w:tcW w:type="dxa" w:w="2900"/>
+            <w:tcBorders>
+              <w:top w:val="single" w:color="B0BEC5" w:sz="4"/>
+              <w:left w:val="single" w:color="B0BEC5" w:sz="4"/>
+              <w:bottom w:val="single" w:color="B0BEC5" w:sz="4"/>
+              <w:right w:val="single" w:color="B0BEC5" w:sz="4"/>
+            </w:tcBorders>
+            <w:tcMar>
+              <w:top w:type="dxa" w:w="60"/>
+              <w:left w:type="dxa" w:w="100"/>
+              <w:bottom w:type="dxa" w:w="60"/>
+              <w:right w:type="dxa" w:w="100"/>
+            </w:tcMar>
+            <w:vAlign w:val="top"/>
+          </w:tcPr>
+          <w:p>
+            <w:pPr>
+              <w:spacing w:after="30" w:line="252"/>
+            </w:pPr>
+            <w:r>
+              <w:rPr>
+                <w:rFonts w:ascii="Arial" w:cs="Arial" w:eastAsia="Arial" w:hAnsi="Arial"/>
+                <w:b w:val="false"/>
+                <w:bCs w:val="false"/>
+                <w:sz w:val="18"/>
+                <w:szCs w:val="18"/>
+              </w:rPr>
+              <w:t xml:space="preserve">PlayerPrefs (</w:t>
+            </w:r>
+            <w:r>
+              <w:rPr>
+                <w:rFonts w:ascii="Consolas" w:cs="Consolas" w:eastAsia="Consolas" w:hAnsi="Consolas"/>
+                <w:b w:val="false"/>
+                <w:bCs w:val="false"/>
+                <w:color w:val="0D47A1"/>
+                <w:sz w:val="17"/>
+                <w:szCs w:val="17"/>
+              </w:rPr>
+              <w:t xml:space="preserve">SettingsStore.cs</w:t>
+            </w:r>
+            <w:r>
+              <w:rPr>
+                <w:rFonts w:ascii="Arial" w:cs="Arial" w:eastAsia="Arial" w:hAnsi="Arial"/>
+                <w:b w:val="false"/>
+                <w:bCs w:val="false"/>
+                <w:sz w:val="18"/>
+                <w:szCs w:val="18"/>
+              </w:rPr>
+              <w:t xml:space="preserve">)</w:t>
+            </w:r>
+          </w:p>
+        </w:tc>
+        <w:tc>
+          <w:tcPr>
+            <w:tcW w:type="dxa" w:w="4280"/>
+            <w:tcBorders>
+              <w:top w:val="single" w:color="B0BEC5" w:sz="4"/>
+              <w:left w:val="single" w:color="B0BEC5" w:sz="4"/>
+              <w:bottom w:val="single" w:color="B0BEC5" w:sz="4"/>
+              <w:right w:val="single" w:color="B0BEC5" w:sz="4"/>
+            </w:tcBorders>
+            <w:tcMar>
+              <w:top w:type="dxa" w:w="60"/>
+              <w:left w:type="dxa" w:w="100"/>
+              <w:bottom w:type="dxa" w:w="60"/>
+              <w:right w:type="dxa" w:w="100"/>
+            </w:tcMar>
+            <w:vAlign w:val="top"/>
+          </w:tcPr>
+          <w:p>
+            <w:pPr>
+              <w:spacing w:after="30" w:line="252"/>
+            </w:pPr>
+            <w:r>
+              <w:rPr>
+                <w:rFonts w:ascii="Arial" w:cs="Arial" w:eastAsia="Arial" w:hAnsi="Arial"/>
+                <w:b w:val="false"/>
+                <w:bCs w:val="false"/>
+                <w:sz w:val="18"/>
+                <w:szCs w:val="18"/>
+              </w:rPr>
+              <w:t xml:space="preserve">Settings and the last player name</w:t>
+            </w:r>
+          </w:p>
+        </w:tc>
+        <w:tc>
+          <w:tcPr>
+            <w:tcW w:type="dxa" w:w="1400"/>
+            <w:tcBorders>
+              <w:top w:val="single" w:color="B0BEC5" w:sz="4"/>
+              <w:left w:val="single" w:color="B0BEC5" w:sz="4"/>
+              <w:bottom w:val="single" w:color="B0BEC5" w:sz="4"/>
+              <w:right w:val="single" w:color="B0BEC5" w:sz="4"/>
+            </w:tcBorders>
+            <w:tcMar>
+              <w:top w:type="dxa" w:w="60"/>
+              <w:left w:type="dxa" w:w="100"/>
+              <w:bottom w:type="dxa" w:w="60"/>
+              <w:right w:type="dxa" w:w="100"/>
+            </w:tcMar>
+            <w:vAlign w:val="top"/>
+          </w:tcPr>
+          <w:p>
+            <w:pPr>
+              <w:spacing w:after="30" w:line="252"/>
+            </w:pPr>
+            <w:r>
+              <w:rPr>
+                <w:rFonts w:ascii="Arial" w:cs="Arial" w:eastAsia="Arial" w:hAnsi="Arial"/>
+                <w:b w:val="false"/>
+                <w:bCs w:val="false"/>
+                <w:sz w:val="18"/>
+                <w:szCs w:val="18"/>
+              </w:rPr>
+              <w:t xml:space="preserve">Built</w:t>
+            </w:r>
+          </w:p>
+        </w:tc>
+      </w:tr>
+      <w:tr>
+        <w:trPr>
+          <w:cantSplit/>
+        </w:trPr>
+        <w:tc>
+          <w:tcPr>
+            <w:tcW w:type="dxa" w:w="1500"/>
+            <w:tcBorders>
+              <w:top w:val="single" w:color="B0BEC5" w:sz="4"/>
+              <w:left w:val="single" w:color="B0BEC5" w:sz="4"/>
+              <w:bottom w:val="single" w:color="B0BEC5" w:sz="4"/>
+              <w:right w:val="single" w:color="B0BEC5" w:sz="4"/>
+            </w:tcBorders>
+            <w:shd w:fill="F5F8FC" w:color="auto" w:val="clear"/>
+            <w:tcMar>
+              <w:top w:type="dxa" w:w="60"/>
+              <w:left w:type="dxa" w:w="100"/>
+              <w:bottom w:type="dxa" w:w="60"/>
+              <w:right w:type="dxa" w:w="100"/>
+            </w:tcMar>
+            <w:vAlign w:val="top"/>
+          </w:tcPr>
+          <w:p>
+            <w:pPr>
+              <w:spacing w:after="30" w:line="252"/>
+            </w:pPr>
+            <w:r>
+              <w:rPr>
+                <w:rFonts w:ascii="Arial" w:cs="Arial" w:eastAsia="Arial" w:hAnsi="Arial"/>
+                <w:b w:val="false"/>
+                <w:bCs w:val="false"/>
+                <w:sz w:val="18"/>
+                <w:szCs w:val="18"/>
+              </w:rPr>
               <w:t xml:space="preserve">Editor tools (not in APK)</w:t>
             </w:r>
           </w:p>
@@ -13851,6 +14690,7 @@
               <w:bottom w:val="single" w:color="B0BEC5" w:sz="4"/>
               <w:right w:val="single" w:color="B0BEC5" w:sz="4"/>
             </w:tcBorders>
+            <w:shd w:fill="F5F8FC" w:color="auto" w:val="clear"/>
             <w:tcMar>
               <w:top w:type="dxa" w:w="60"/>
               <w:left w:type="dxa" w:w="100"/>
@@ -13916,6 +14756,69 @@
               </w:rPr>
               <w:t xml:space="preserve">UiKit.cs</w:t>
             </w:r>
+            <w:r>
+              <w:rPr>
+                <w:rFonts w:ascii="Arial" w:cs="Arial" w:eastAsia="Arial" w:hAnsi="Arial"/>
+                <w:b w:val="false"/>
+                <w:bCs w:val="false"/>
+                <w:sz w:val="18"/>
+                <w:szCs w:val="18"/>
+              </w:rPr>
+              <w:t xml:space="preserve">, </w:t>
+            </w:r>
+            <w:r>
+              <w:rPr>
+                <w:rFonts w:ascii="Consolas" w:cs="Consolas" w:eastAsia="Consolas" w:hAnsi="Consolas"/>
+                <w:b w:val="false"/>
+                <w:bCs w:val="false"/>
+                <w:color w:val="0D47A1"/>
+                <w:sz w:val="17"/>
+                <w:szCs w:val="17"/>
+              </w:rPr>
+              <w:t xml:space="preserve">PlaytestMenu.cs</w:t>
+            </w:r>
+            <w:r>
+              <w:rPr>
+                <w:rFonts w:ascii="Arial" w:cs="Arial" w:eastAsia="Arial" w:hAnsi="Arial"/>
+                <w:b w:val="false"/>
+                <w:bCs w:val="false"/>
+                <w:sz w:val="18"/>
+                <w:szCs w:val="18"/>
+              </w:rPr>
+              <w:t xml:space="preserve"> + </w:t>
+            </w:r>
+            <w:r>
+              <w:rPr>
+                <w:rFonts w:ascii="Consolas" w:cs="Consolas" w:eastAsia="Consolas" w:hAnsi="Consolas"/>
+                <w:b w:val="false"/>
+                <w:bCs w:val="false"/>
+                <w:color w:val="0D47A1"/>
+                <w:sz w:val="17"/>
+                <w:szCs w:val="17"/>
+              </w:rPr>
+              <w:t xml:space="preserve">AutoPlaytest.cs</w:t>
+            </w:r>
+            <w:r>
+              <w:rPr>
+                <w:rFonts w:ascii="Arial" w:cs="Arial" w:eastAsia="Arial" w:hAnsi="Arial"/>
+                <w:b w:val="false"/>
+                <w:bCs w:val="false"/>
+                <w:sz w:val="18"/>
+                <w:szCs w:val="18"/>
+              </w:rPr>
+              <w:t xml:space="preserve">, </w:t>
+            </w:r>
+            <w:r>
+              <w:rPr>
+                <w:rFonts w:ascii="Consolas" w:cs="Consolas" w:eastAsia="Consolas" w:hAnsi="Consolas"/>
+                <w:b w:val="false"/>
+                <w:bCs w:val="false"/>
+                <w:color w:val="0D47A1"/>
+                <w:sz w:val="17"/>
+                <w:szCs w:val="17"/>
+              </w:rPr>
+              <w:t xml:space="preserve">QuickCheck.cs</w:t>
+            </w:r>
           </w:p>
         </w:tc>
         <w:tc>
@@ -13927,27 +14830,28 @@
               <w:bottom w:val="single" w:color="B0BEC5" w:sz="4"/>
               <w:right w:val="single" w:color="B0BEC5" w:sz="4"/>
             </w:tcBorders>
-            <w:tcMar>
-              <w:top w:type="dxa" w:w="60"/>
-              <w:left w:type="dxa" w:w="100"/>
-              <w:bottom w:type="dxa" w:w="60"/>
-              <w:right w:type="dxa" w:w="100"/>
-            </w:tcMar>
-            <w:vAlign w:val="top"/>
-          </w:tcPr>
-          <w:p>
-            <w:pPr>
-              <w:spacing w:after="30" w:line="252"/>
-            </w:pPr>
-            <w:r>
-              <w:rPr>
-                <w:rFonts w:ascii="Arial" w:cs="Arial" w:eastAsia="Arial" w:hAnsi="Arial"/>
-                <w:b w:val="false"/>
-                <w:bCs w:val="false"/>
-                <w:sz w:val="18"/>
-                <w:szCs w:val="18"/>
-              </w:rPr>
-              <w:t xml:space="preserve">Import art; build animations, the 10 levels, the boss, the Main Menu and battle scenes; wire references</w:t>
+            <w:shd w:fill="F5F8FC" w:color="auto" w:val="clear"/>
+            <w:tcMar>
+              <w:top w:type="dxa" w:w="60"/>
+              <w:left w:type="dxa" w:w="100"/>
+              <w:bottom w:type="dxa" w:w="60"/>
+              <w:right w:type="dxa" w:w="100"/>
+            </w:tcMar>
+            <w:vAlign w:val="top"/>
+          </w:tcPr>
+          <w:p>
+            <w:pPr>
+              <w:spacing w:after="30" w:line="252"/>
+            </w:pPr>
+            <w:r>
+              <w:rPr>
+                <w:rFonts w:ascii="Arial" w:cs="Arial" w:eastAsia="Arial" w:hAnsi="Arial"/>
+                <w:b w:val="false"/>
+                <w:bCs w:val="false"/>
+                <w:sz w:val="18"/>
+                <w:szCs w:val="18"/>
+              </w:rPr>
+              <w:t xml:space="preserve">Import art; build animations, the 10 levels, the boss, the Main Menu and battle scenes; wire references; automatic Stage 1 play-test (editor only)</w:t>
             </w:r>
           </w:p>
         </w:tc>
@@ -13960,6 +14864,7 @@
               <w:bottom w:val="single" w:color="B0BEC5" w:sz="4"/>
               <w:right w:val="single" w:color="B0BEC5" w:sz="4"/>
             </w:tcBorders>
+            <w:shd w:fill="F5F8FC" w:color="auto" w:val="clear"/>
             <w:tcMar>
               <w:top w:type="dxa" w:w="60"/>
               <w:left w:type="dxa" w:w="100"/>

</xml_diff>